<commit_message>
Set justified alignment and 1.5 line spacing in seminar paper
Co-Authored-By: Claude Fable 5 <noreply@anthropic.com>
Claude-Session: https://claude.ai/code/session_01LwWT2RXpwEyndDcP4wd3kJ
</commit_message>
<xml_diff>
--- a/seminar/seminar.docx
+++ b/seminar/seminar.docx
@@ -5,7 +5,7 @@
     <w:p>
       <w:pPr>
         <w:bidi/>
-        <w:spacing w:after="60" w:line="480" w:lineRule="auto"/>
+        <w:spacing w:after="60" w:line="360" w:lineRule="auto"/>
         <w:jc w:val="center"/>
       </w:pPr>
       <w:r>
@@ -24,7 +24,7 @@
     <w:p>
       <w:pPr>
         <w:bidi/>
-        <w:spacing w:after="60" w:line="480" w:lineRule="auto"/>
+        <w:spacing w:after="60" w:line="360" w:lineRule="auto"/>
         <w:jc w:val="center"/>
       </w:pPr>
       <w:r>
@@ -43,7 +43,7 @@
     <w:p>
       <w:pPr>
         <w:bidi/>
-        <w:spacing w:after="60" w:line="480" w:lineRule="auto"/>
+        <w:spacing w:after="60" w:line="360" w:lineRule="auto"/>
         <w:jc w:val="center"/>
       </w:pPr>
       <w:r>
@@ -62,7 +62,7 @@
     <w:p>
       <w:pPr>
         <w:bidi/>
-        <w:spacing w:after="60" w:line="480" w:lineRule="auto"/>
+        <w:spacing w:after="60" w:line="360" w:lineRule="auto"/>
         <w:jc w:val="center"/>
       </w:pPr>
       <w:r>
@@ -80,7 +80,7 @@
     <w:p>
       <w:pPr>
         <w:bidi/>
-        <w:spacing w:after="200" w:line="480" w:lineRule="auto"/>
+        <w:spacing w:after="200" w:line="360" w:lineRule="auto"/>
         <w:jc w:val="center"/>
       </w:pPr>
       <w:r>
@@ -103,7 +103,7 @@
     <w:p>
       <w:pPr>
         <w:bidi/>
-        <w:spacing w:after="200" w:line="480" w:lineRule="auto"/>
+        <w:spacing w:after="200" w:line="360" w:lineRule="auto"/>
         <w:jc w:val="center"/>
       </w:pPr>
       <w:r>
@@ -127,7 +127,7 @@
     <w:p>
       <w:pPr>
         <w:bidi/>
-        <w:spacing w:after="60" w:line="480" w:lineRule="auto"/>
+        <w:spacing w:after="60" w:line="360" w:lineRule="auto"/>
         <w:jc w:val="center"/>
       </w:pPr>
       <w:r>
@@ -145,7 +145,7 @@
     <w:p>
       <w:pPr>
         <w:bidi/>
-        <w:spacing w:after="200" w:line="480" w:lineRule="auto"/>
+        <w:spacing w:after="200" w:line="360" w:lineRule="auto"/>
         <w:jc w:val="center"/>
       </w:pPr>
       <w:r>
@@ -163,7 +163,7 @@
     <w:p>
       <w:pPr>
         <w:bidi/>
-        <w:spacing w:after="60" w:line="480" w:lineRule="auto"/>
+        <w:spacing w:after="60" w:line="360" w:lineRule="auto"/>
         <w:jc w:val="center"/>
       </w:pPr>
       <w:r>
@@ -181,7 +181,7 @@
     <w:p>
       <w:pPr>
         <w:bidi/>
-        <w:spacing w:after="60" w:line="480" w:lineRule="auto"/>
+        <w:spacing w:after="60" w:line="360" w:lineRule="auto"/>
         <w:jc w:val="center"/>
       </w:pPr>
       <w:r>
@@ -199,7 +199,7 @@
     <w:p>
       <w:pPr>
         <w:bidi/>
-        <w:spacing w:after="60" w:line="480" w:lineRule="auto"/>
+        <w:spacing w:after="60" w:line="360" w:lineRule="auto"/>
         <w:jc w:val="center"/>
       </w:pPr>
       <w:r>
@@ -277,7 +277,7 @@
       <w:pPr>
         <w:pStyle w:val="Heading1"/>
         <w:bidi/>
-        <w:spacing w:after="240" w:before="360" w:line="480" w:lineRule="auto"/>
+        <w:spacing w:after="240" w:before="360" w:line="360" w:lineRule="auto"/>
         <w:jc w:val="right"/>
       </w:pPr>
       <w:r>
@@ -296,8 +296,8 @@
     <w:p>
       <w:pPr>
         <w:bidi/>
-        <w:spacing w:after="120" w:line="480" w:lineRule="auto"/>
-        <w:jc w:val="right"/>
+        <w:spacing w:after="120" w:line="360" w:lineRule="auto"/>
+        <w:jc w:val="both"/>
       </w:pPr>
       <w:r>
         <w:rPr>
@@ -314,8 +314,8 @@
     <w:p>
       <w:pPr>
         <w:bidi/>
-        <w:spacing w:after="120" w:line="480" w:lineRule="auto"/>
-        <w:jc w:val="right"/>
+        <w:spacing w:after="120" w:line="360" w:lineRule="auto"/>
+        <w:jc w:val="both"/>
       </w:pPr>
       <w:r>
         <w:rPr>
@@ -332,8 +332,8 @@
     <w:p>
       <w:pPr>
         <w:bidi/>
-        <w:spacing w:after="120" w:line="480" w:lineRule="auto"/>
-        <w:jc w:val="right"/>
+        <w:spacing w:after="120" w:line="360" w:lineRule="auto"/>
+        <w:jc w:val="both"/>
       </w:pPr>
       <w:r>
         <w:rPr>
@@ -356,7 +356,7 @@
       <w:pPr>
         <w:pStyle w:val="Heading1"/>
         <w:bidi/>
-        <w:spacing w:after="240" w:before="360" w:line="480" w:lineRule="auto"/>
+        <w:spacing w:after="240" w:before="360" w:line="360" w:lineRule="auto"/>
         <w:jc w:val="right"/>
       </w:pPr>
       <w:r>
@@ -375,8 +375,8 @@
     <w:p>
       <w:pPr>
         <w:bidi/>
-        <w:spacing w:after="120" w:line="480" w:lineRule="auto"/>
-        <w:jc w:val="right"/>
+        <w:spacing w:after="120" w:line="360" w:lineRule="auto"/>
+        <w:jc w:val="both"/>
       </w:pPr>
       <w:r>
         <w:rPr>
@@ -394,7 +394,7 @@
       <w:pPr>
         <w:pStyle w:val="Heading2"/>
         <w:bidi/>
-        <w:spacing w:after="180" w:before="280" w:line="480" w:lineRule="auto"/>
+        <w:spacing w:after="180" w:before="280" w:line="360" w:lineRule="auto"/>
         <w:jc w:val="right"/>
       </w:pPr>
       <w:r>
@@ -413,8 +413,8 @@
     <w:p>
       <w:pPr>
         <w:bidi/>
-        <w:spacing w:after="120" w:line="480" w:lineRule="auto"/>
-        <w:jc w:val="right"/>
+        <w:spacing w:after="120" w:line="360" w:lineRule="auto"/>
+        <w:jc w:val="both"/>
       </w:pPr>
       <w:r>
         <w:rPr>
@@ -431,8 +431,8 @@
     <w:p>
       <w:pPr>
         <w:bidi/>
-        <w:spacing w:after="120" w:line="480" w:lineRule="auto"/>
-        <w:jc w:val="right"/>
+        <w:spacing w:after="120" w:line="360" w:lineRule="auto"/>
+        <w:jc w:val="both"/>
       </w:pPr>
       <w:r>
         <w:rPr>
@@ -449,8 +449,8 @@
     <w:p>
       <w:pPr>
         <w:bidi/>
-        <w:spacing w:after="120" w:line="480" w:lineRule="auto"/>
-        <w:jc w:val="right"/>
+        <w:spacing w:after="120" w:line="360" w:lineRule="auto"/>
+        <w:jc w:val="both"/>
       </w:pPr>
       <w:r>
         <w:rPr>
@@ -467,8 +467,8 @@
     <w:p>
       <w:pPr>
         <w:bidi/>
-        <w:spacing w:after="120" w:line="480" w:lineRule="auto"/>
-        <w:jc w:val="right"/>
+        <w:spacing w:after="120" w:line="360" w:lineRule="auto"/>
+        <w:jc w:val="both"/>
       </w:pPr>
       <w:r>
         <w:rPr>
@@ -486,7 +486,7 @@
       <w:pPr>
         <w:pStyle w:val="Heading2"/>
         <w:bidi/>
-        <w:spacing w:after="180" w:before="280" w:line="480" w:lineRule="auto"/>
+        <w:spacing w:after="180" w:before="280" w:line="360" w:lineRule="auto"/>
         <w:jc w:val="right"/>
       </w:pPr>
       <w:r>
@@ -505,8 +505,8 @@
     <w:p>
       <w:pPr>
         <w:bidi/>
-        <w:spacing w:after="120" w:line="480" w:lineRule="auto"/>
-        <w:jc w:val="right"/>
+        <w:spacing w:after="120" w:line="360" w:lineRule="auto"/>
+        <w:jc w:val="both"/>
       </w:pPr>
       <w:r>
         <w:rPr>
@@ -523,8 +523,8 @@
     <w:p>
       <w:pPr>
         <w:bidi/>
-        <w:spacing w:after="120" w:line="480" w:lineRule="auto"/>
-        <w:jc w:val="right"/>
+        <w:spacing w:after="120" w:line="360" w:lineRule="auto"/>
+        <w:jc w:val="both"/>
       </w:pPr>
       <w:r>
         <w:rPr>
@@ -541,8 +541,8 @@
     <w:p>
       <w:pPr>
         <w:bidi/>
-        <w:spacing w:after="120" w:line="480" w:lineRule="auto"/>
-        <w:jc w:val="right"/>
+        <w:spacing w:after="120" w:line="360" w:lineRule="auto"/>
+        <w:jc w:val="both"/>
       </w:pPr>
       <w:r>
         <w:rPr>
@@ -559,8 +559,8 @@
     <w:p>
       <w:pPr>
         <w:bidi/>
-        <w:spacing w:after="120" w:line="480" w:lineRule="auto"/>
-        <w:jc w:val="right"/>
+        <w:spacing w:after="120" w:line="360" w:lineRule="auto"/>
+        <w:jc w:val="both"/>
       </w:pPr>
       <w:r>
         <w:rPr>
@@ -578,7 +578,7 @@
       <w:pPr>
         <w:pStyle w:val="Heading2"/>
         <w:bidi/>
-        <w:spacing w:after="180" w:before="280" w:line="480" w:lineRule="auto"/>
+        <w:spacing w:after="180" w:before="280" w:line="360" w:lineRule="auto"/>
         <w:jc w:val="right"/>
       </w:pPr>
       <w:r>
@@ -597,8 +597,8 @@
     <w:p>
       <w:pPr>
         <w:bidi/>
-        <w:spacing w:after="120" w:line="480" w:lineRule="auto"/>
-        <w:jc w:val="right"/>
+        <w:spacing w:after="120" w:line="360" w:lineRule="auto"/>
+        <w:jc w:val="both"/>
       </w:pPr>
       <w:r>
         <w:rPr>
@@ -615,8 +615,8 @@
     <w:p>
       <w:pPr>
         <w:bidi/>
-        <w:spacing w:after="120" w:line="480" w:lineRule="auto"/>
-        <w:jc w:val="right"/>
+        <w:spacing w:after="120" w:line="360" w:lineRule="auto"/>
+        <w:jc w:val="both"/>
       </w:pPr>
       <w:r>
         <w:rPr>
@@ -633,8 +633,8 @@
     <w:p>
       <w:pPr>
         <w:bidi/>
-        <w:spacing w:after="120" w:line="480" w:lineRule="auto"/>
-        <w:jc w:val="right"/>
+        <w:spacing w:after="120" w:line="360" w:lineRule="auto"/>
+        <w:jc w:val="both"/>
       </w:pPr>
       <w:r>
         <w:rPr>
@@ -652,7 +652,7 @@
       <w:pPr>
         <w:pStyle w:val="Heading2"/>
         <w:bidi/>
-        <w:spacing w:after="180" w:before="280" w:line="480" w:lineRule="auto"/>
+        <w:spacing w:after="180" w:before="280" w:line="360" w:lineRule="auto"/>
         <w:jc w:val="right"/>
       </w:pPr>
       <w:r>
@@ -671,8 +671,8 @@
     <w:p>
       <w:pPr>
         <w:bidi/>
-        <w:spacing w:after="120" w:line="480" w:lineRule="auto"/>
-        <w:jc w:val="right"/>
+        <w:spacing w:after="120" w:line="360" w:lineRule="auto"/>
+        <w:jc w:val="both"/>
       </w:pPr>
       <w:r>
         <w:rPr>
@@ -689,8 +689,8 @@
     <w:p>
       <w:pPr>
         <w:bidi/>
-        <w:spacing w:after="120" w:line="480" w:lineRule="auto"/>
-        <w:jc w:val="right"/>
+        <w:spacing w:after="120" w:line="360" w:lineRule="auto"/>
+        <w:jc w:val="both"/>
       </w:pPr>
       <w:r>
         <w:rPr>
@@ -707,8 +707,8 @@
     <w:p>
       <w:pPr>
         <w:bidi/>
-        <w:spacing w:after="120" w:line="480" w:lineRule="auto"/>
-        <w:jc w:val="right"/>
+        <w:spacing w:after="120" w:line="360" w:lineRule="auto"/>
+        <w:jc w:val="both"/>
       </w:pPr>
       <w:r>
         <w:rPr>
@@ -725,8 +725,8 @@
     <w:p>
       <w:pPr>
         <w:bidi/>
-        <w:spacing w:after="120" w:line="480" w:lineRule="auto"/>
-        <w:jc w:val="right"/>
+        <w:spacing w:after="120" w:line="360" w:lineRule="auto"/>
+        <w:jc w:val="both"/>
       </w:pPr>
       <w:r>
         <w:rPr>
@@ -749,7 +749,7 @@
       <w:pPr>
         <w:pStyle w:val="Heading1"/>
         <w:bidi/>
-        <w:spacing w:after="240" w:before="360" w:line="480" w:lineRule="auto"/>
+        <w:spacing w:after="240" w:before="360" w:line="360" w:lineRule="auto"/>
         <w:jc w:val="right"/>
       </w:pPr>
       <w:r>
@@ -769,7 +769,7 @@
       <w:pPr>
         <w:pStyle w:val="Heading2"/>
         <w:bidi/>
-        <w:spacing w:after="180" w:before="280" w:line="480" w:lineRule="auto"/>
+        <w:spacing w:after="180" w:before="280" w:line="360" w:lineRule="auto"/>
         <w:jc w:val="right"/>
       </w:pPr>
       <w:r>
@@ -788,8 +788,8 @@
     <w:p>
       <w:pPr>
         <w:bidi/>
-        <w:spacing w:after="120" w:line="480" w:lineRule="auto"/>
-        <w:jc w:val="right"/>
+        <w:spacing w:after="120" w:line="360" w:lineRule="auto"/>
+        <w:jc w:val="both"/>
       </w:pPr>
       <w:r>
         <w:rPr>
@@ -807,7 +807,7 @@
       <w:pPr>
         <w:pStyle w:val="Heading2"/>
         <w:bidi/>
-        <w:spacing w:after="180" w:before="280" w:line="480" w:lineRule="auto"/>
+        <w:spacing w:after="180" w:before="280" w:line="360" w:lineRule="auto"/>
         <w:jc w:val="right"/>
       </w:pPr>
       <w:r>
@@ -826,8 +826,8 @@
     <w:p>
       <w:pPr>
         <w:bidi/>
-        <w:spacing w:after="120" w:line="480" w:lineRule="auto"/>
-        <w:jc w:val="right"/>
+        <w:spacing w:after="120" w:line="360" w:lineRule="auto"/>
+        <w:jc w:val="both"/>
       </w:pPr>
       <w:r>
         <w:rPr>
@@ -845,7 +845,7 @@
       <w:pPr>
         <w:pStyle w:val="Heading2"/>
         <w:bidi/>
-        <w:spacing w:after="180" w:before="280" w:line="480" w:lineRule="auto"/>
+        <w:spacing w:after="180" w:before="280" w:line="360" w:lineRule="auto"/>
         <w:jc w:val="right"/>
       </w:pPr>
       <w:r>
@@ -864,8 +864,8 @@
     <w:p>
       <w:pPr>
         <w:bidi/>
-        <w:spacing w:after="120" w:line="480" w:lineRule="auto"/>
-        <w:jc w:val="right"/>
+        <w:spacing w:after="120" w:line="360" w:lineRule="auto"/>
+        <w:jc w:val="both"/>
       </w:pPr>
       <w:r>
         <w:rPr>
@@ -882,8 +882,8 @@
     <w:p>
       <w:pPr>
         <w:bidi/>
-        <w:spacing w:after="120" w:line="480" w:lineRule="auto"/>
-        <w:jc w:val="right"/>
+        <w:spacing w:after="120" w:line="360" w:lineRule="auto"/>
+        <w:jc w:val="both"/>
       </w:pPr>
       <w:r>
         <w:rPr>
@@ -900,8 +900,8 @@
     <w:p>
       <w:pPr>
         <w:bidi/>
-        <w:spacing w:after="120" w:line="480" w:lineRule="auto"/>
-        <w:jc w:val="right"/>
+        <w:spacing w:after="120" w:line="360" w:lineRule="auto"/>
+        <w:jc w:val="both"/>
       </w:pPr>
       <w:r>
         <w:rPr>
@@ -919,7 +919,7 @@
       <w:pPr>
         <w:pStyle w:val="Heading2"/>
         <w:bidi/>
-        <w:spacing w:after="180" w:before="280" w:line="480" w:lineRule="auto"/>
+        <w:spacing w:after="180" w:before="280" w:line="360" w:lineRule="auto"/>
         <w:jc w:val="right"/>
       </w:pPr>
       <w:r>
@@ -938,8 +938,8 @@
     <w:p>
       <w:pPr>
         <w:bidi/>
-        <w:spacing w:after="120" w:line="480" w:lineRule="auto"/>
-        <w:jc w:val="right"/>
+        <w:spacing w:after="120" w:line="360" w:lineRule="auto"/>
+        <w:jc w:val="both"/>
       </w:pPr>
       <w:r>
         <w:rPr>
@@ -957,7 +957,7 @@
       <w:pPr>
         <w:pStyle w:val="Heading2"/>
         <w:bidi/>
-        <w:spacing w:after="180" w:before="280" w:line="480" w:lineRule="auto"/>
+        <w:spacing w:after="180" w:before="280" w:line="360" w:lineRule="auto"/>
         <w:jc w:val="right"/>
       </w:pPr>
       <w:r>
@@ -976,8 +976,8 @@
     <w:p>
       <w:pPr>
         <w:bidi/>
-        <w:spacing w:after="120" w:line="480" w:lineRule="auto"/>
-        <w:jc w:val="right"/>
+        <w:spacing w:after="120" w:line="360" w:lineRule="auto"/>
+        <w:jc w:val="both"/>
       </w:pPr>
       <w:r>
         <w:rPr>
@@ -994,8 +994,8 @@
     <w:p>
       <w:pPr>
         <w:bidi/>
-        <w:spacing w:after="120" w:line="480" w:lineRule="auto"/>
-        <w:jc w:val="right"/>
+        <w:spacing w:after="120" w:line="360" w:lineRule="auto"/>
+        <w:jc w:val="both"/>
       </w:pPr>
       <w:r>
         <w:rPr>
@@ -1012,8 +1012,8 @@
     <w:p>
       <w:pPr>
         <w:bidi/>
-        <w:spacing w:after="120" w:line="480" w:lineRule="auto"/>
-        <w:jc w:val="right"/>
+        <w:spacing w:after="120" w:line="360" w:lineRule="auto"/>
+        <w:jc w:val="both"/>
       </w:pPr>
       <w:r>
         <w:rPr>
@@ -1030,8 +1030,8 @@
     <w:p>
       <w:pPr>
         <w:bidi/>
-        <w:spacing w:after="120" w:line="480" w:lineRule="auto"/>
-        <w:jc w:val="right"/>
+        <w:spacing w:after="120" w:line="360" w:lineRule="auto"/>
+        <w:jc w:val="both"/>
       </w:pPr>
       <w:r>
         <w:rPr>
@@ -1054,7 +1054,7 @@
       <w:pPr>
         <w:pStyle w:val="Heading1"/>
         <w:bidi/>
-        <w:spacing w:after="240" w:before="360" w:line="480" w:lineRule="auto"/>
+        <w:spacing w:after="240" w:before="360" w:line="360" w:lineRule="auto"/>
         <w:jc w:val="right"/>
       </w:pPr>
       <w:r>
@@ -1073,8 +1073,8 @@
     <w:p>
       <w:pPr>
         <w:bidi/>
-        <w:spacing w:after="120" w:line="480" w:lineRule="auto"/>
-        <w:jc w:val="right"/>
+        <w:spacing w:after="120" w:line="360" w:lineRule="auto"/>
+        <w:jc w:val="both"/>
       </w:pPr>
       <w:r>
         <w:rPr>
@@ -1092,7 +1092,7 @@
       <w:pPr>
         <w:pStyle w:val="Heading2"/>
         <w:bidi/>
-        <w:spacing w:after="180" w:before="280" w:line="480" w:lineRule="auto"/>
+        <w:spacing w:after="180" w:before="280" w:line="360" w:lineRule="auto"/>
         <w:jc w:val="right"/>
       </w:pPr>
       <w:r>
@@ -1111,8 +1111,8 @@
     <w:p>
       <w:pPr>
         <w:bidi/>
-        <w:spacing w:after="120" w:line="480" w:lineRule="auto"/>
-        <w:jc w:val="right"/>
+        <w:spacing w:after="120" w:line="360" w:lineRule="auto"/>
+        <w:jc w:val="both"/>
       </w:pPr>
       <w:r>
         <w:rPr>
@@ -1129,8 +1129,8 @@
     <w:p>
       <w:pPr>
         <w:bidi/>
-        <w:spacing w:after="120" w:line="480" w:lineRule="auto"/>
-        <w:jc w:val="right"/>
+        <w:spacing w:after="120" w:line="360" w:lineRule="auto"/>
+        <w:jc w:val="both"/>
       </w:pPr>
       <w:r>
         <w:rPr>
@@ -1147,8 +1147,8 @@
     <w:p>
       <w:pPr>
         <w:bidi/>
-        <w:spacing w:after="120" w:line="480" w:lineRule="auto"/>
-        <w:jc w:val="right"/>
+        <w:spacing w:after="120" w:line="360" w:lineRule="auto"/>
+        <w:jc w:val="both"/>
       </w:pPr>
       <w:r>
         <w:rPr>
@@ -1166,7 +1166,7 @@
       <w:pPr>
         <w:pStyle w:val="Heading2"/>
         <w:bidi/>
-        <w:spacing w:after="180" w:before="280" w:line="480" w:lineRule="auto"/>
+        <w:spacing w:after="180" w:before="280" w:line="360" w:lineRule="auto"/>
         <w:jc w:val="right"/>
       </w:pPr>
       <w:r>
@@ -1185,8 +1185,8 @@
     <w:p>
       <w:pPr>
         <w:bidi/>
-        <w:spacing w:after="120" w:line="480" w:lineRule="auto"/>
-        <w:jc w:val="right"/>
+        <w:spacing w:after="120" w:line="360" w:lineRule="auto"/>
+        <w:jc w:val="both"/>
       </w:pPr>
       <w:r>
         <w:rPr>
@@ -1203,9 +1203,9 @@
     <w:p>
       <w:pPr>
         <w:bidi/>
-        <w:spacing w:after="120" w:line="480" w:lineRule="auto"/>
+        <w:spacing w:after="120" w:line="360" w:lineRule="auto"/>
         <w:ind w:left="720" w:right="720"/>
-        <w:jc w:val="right"/>
+        <w:jc w:val="both"/>
       </w:pPr>
       <w:r>
         <w:rPr>
@@ -1222,8 +1222,8 @@
     <w:p>
       <w:pPr>
         <w:bidi/>
-        <w:spacing w:after="120" w:line="480" w:lineRule="auto"/>
-        <w:jc w:val="right"/>
+        <w:spacing w:after="120" w:line="360" w:lineRule="auto"/>
+        <w:jc w:val="both"/>
       </w:pPr>
       <w:r>
         <w:rPr>
@@ -1240,8 +1240,8 @@
     <w:p>
       <w:pPr>
         <w:bidi/>
-        <w:spacing w:after="120" w:line="480" w:lineRule="auto"/>
-        <w:jc w:val="right"/>
+        <w:spacing w:after="120" w:line="360" w:lineRule="auto"/>
+        <w:jc w:val="both"/>
       </w:pPr>
       <w:r>
         <w:rPr>
@@ -1259,7 +1259,7 @@
       <w:pPr>
         <w:pStyle w:val="Heading2"/>
         <w:bidi/>
-        <w:spacing w:after="180" w:before="280" w:line="480" w:lineRule="auto"/>
+        <w:spacing w:after="180" w:before="280" w:line="360" w:lineRule="auto"/>
         <w:jc w:val="right"/>
       </w:pPr>
       <w:r>
@@ -1278,8 +1278,8 @@
     <w:p>
       <w:pPr>
         <w:bidi/>
-        <w:spacing w:after="120" w:line="480" w:lineRule="auto"/>
-        <w:jc w:val="right"/>
+        <w:spacing w:after="120" w:line="360" w:lineRule="auto"/>
+        <w:jc w:val="both"/>
       </w:pPr>
       <w:r>
         <w:rPr>
@@ -1296,8 +1296,8 @@
     <w:p>
       <w:pPr>
         <w:bidi/>
-        <w:spacing w:after="120" w:line="480" w:lineRule="auto"/>
-        <w:jc w:val="right"/>
+        <w:spacing w:after="120" w:line="360" w:lineRule="auto"/>
+        <w:jc w:val="both"/>
       </w:pPr>
       <w:r>
         <w:rPr>
@@ -1314,8 +1314,8 @@
     <w:p>
       <w:pPr>
         <w:bidi/>
-        <w:spacing w:after="120" w:line="480" w:lineRule="auto"/>
-        <w:jc w:val="right"/>
+        <w:spacing w:after="120" w:line="360" w:lineRule="auto"/>
+        <w:jc w:val="both"/>
       </w:pPr>
       <w:r>
         <w:rPr>
@@ -1332,8 +1332,8 @@
     <w:p>
       <w:pPr>
         <w:bidi/>
-        <w:spacing w:after="120" w:line="480" w:lineRule="auto"/>
-        <w:jc w:val="right"/>
+        <w:spacing w:after="120" w:line="360" w:lineRule="auto"/>
+        <w:jc w:val="both"/>
       </w:pPr>
       <w:r>
         <w:rPr>
@@ -1351,7 +1351,7 @@
       <w:pPr>
         <w:pStyle w:val="Heading2"/>
         <w:bidi/>
-        <w:spacing w:after="180" w:before="280" w:line="480" w:lineRule="auto"/>
+        <w:spacing w:after="180" w:before="280" w:line="360" w:lineRule="auto"/>
         <w:jc w:val="right"/>
       </w:pPr>
       <w:r>
@@ -1370,8 +1370,8 @@
     <w:p>
       <w:pPr>
         <w:bidi/>
-        <w:spacing w:after="120" w:line="480" w:lineRule="auto"/>
-        <w:jc w:val="right"/>
+        <w:spacing w:after="120" w:line="360" w:lineRule="auto"/>
+        <w:jc w:val="both"/>
       </w:pPr>
       <w:r>
         <w:rPr>
@@ -1388,9 +1388,9 @@
     <w:p>
       <w:pPr>
         <w:bidi/>
-        <w:spacing w:after="120" w:line="480" w:lineRule="auto"/>
+        <w:spacing w:after="120" w:line="360" w:lineRule="auto"/>
         <w:ind w:left="720" w:right="720"/>
-        <w:jc w:val="right"/>
+        <w:jc w:val="both"/>
       </w:pPr>
       <w:r>
         <w:rPr>
@@ -1407,8 +1407,8 @@
     <w:p>
       <w:pPr>
         <w:bidi/>
-        <w:spacing w:after="120" w:line="480" w:lineRule="auto"/>
-        <w:jc w:val="right"/>
+        <w:spacing w:after="120" w:line="360" w:lineRule="auto"/>
+        <w:jc w:val="both"/>
       </w:pPr>
       <w:r>
         <w:rPr>
@@ -1426,7 +1426,7 @@
       <w:pPr>
         <w:pStyle w:val="Heading2"/>
         <w:bidi/>
-        <w:spacing w:after="180" w:before="280" w:line="480" w:lineRule="auto"/>
+        <w:spacing w:after="180" w:before="280" w:line="360" w:lineRule="auto"/>
         <w:jc w:val="right"/>
       </w:pPr>
       <w:r>
@@ -1445,8 +1445,8 @@
     <w:p>
       <w:pPr>
         <w:bidi/>
-        <w:spacing w:after="120" w:line="480" w:lineRule="auto"/>
-        <w:jc w:val="right"/>
+        <w:spacing w:after="120" w:line="360" w:lineRule="auto"/>
+        <w:jc w:val="both"/>
       </w:pPr>
       <w:r>
         <w:rPr>
@@ -1463,8 +1463,8 @@
     <w:p>
       <w:pPr>
         <w:bidi/>
-        <w:spacing w:after="120" w:line="480" w:lineRule="auto"/>
-        <w:jc w:val="right"/>
+        <w:spacing w:after="120" w:line="360" w:lineRule="auto"/>
+        <w:jc w:val="both"/>
       </w:pPr>
       <w:r>
         <w:rPr>
@@ -1481,8 +1481,8 @@
     <w:p>
       <w:pPr>
         <w:bidi/>
-        <w:spacing w:after="120" w:line="480" w:lineRule="auto"/>
-        <w:jc w:val="right"/>
+        <w:spacing w:after="120" w:line="360" w:lineRule="auto"/>
+        <w:jc w:val="both"/>
       </w:pPr>
       <w:r>
         <w:rPr>
@@ -1499,8 +1499,8 @@
     <w:p>
       <w:pPr>
         <w:bidi/>
-        <w:spacing w:after="120" w:line="480" w:lineRule="auto"/>
-        <w:jc w:val="right"/>
+        <w:spacing w:after="120" w:line="360" w:lineRule="auto"/>
+        <w:jc w:val="both"/>
       </w:pPr>
       <w:r>
         <w:rPr>
@@ -1523,7 +1523,7 @@
       <w:pPr>
         <w:pStyle w:val="Heading1"/>
         <w:bidi/>
-        <w:spacing w:after="240" w:before="360" w:line="480" w:lineRule="auto"/>
+        <w:spacing w:after="240" w:before="360" w:line="360" w:lineRule="auto"/>
         <w:jc w:val="right"/>
       </w:pPr>
       <w:r>
@@ -1542,8 +1542,8 @@
     <w:p>
       <w:pPr>
         <w:bidi/>
-        <w:spacing w:after="120" w:line="480" w:lineRule="auto"/>
-        <w:jc w:val="right"/>
+        <w:spacing w:after="120" w:line="360" w:lineRule="auto"/>
+        <w:jc w:val="both"/>
       </w:pPr>
       <w:r>
         <w:rPr>
@@ -1561,7 +1561,7 @@
       <w:pPr>
         <w:pStyle w:val="Heading2"/>
         <w:bidi/>
-        <w:spacing w:after="180" w:before="280" w:line="480" w:lineRule="auto"/>
+        <w:spacing w:after="180" w:before="280" w:line="360" w:lineRule="auto"/>
         <w:jc w:val="right"/>
       </w:pPr>
       <w:r>
@@ -1581,7 +1581,7 @@
       <w:pPr>
         <w:pStyle w:val="Heading3"/>
         <w:bidi/>
-        <w:spacing w:after="140" w:before="220" w:line="480" w:lineRule="auto"/>
+        <w:spacing w:after="140" w:before="220" w:line="360" w:lineRule="auto"/>
         <w:jc w:val="right"/>
       </w:pPr>
       <w:r>
@@ -1600,8 +1600,8 @@
     <w:p>
       <w:pPr>
         <w:bidi/>
-        <w:spacing w:after="120" w:line="480" w:lineRule="auto"/>
-        <w:jc w:val="right"/>
+        <w:spacing w:after="120" w:line="360" w:lineRule="auto"/>
+        <w:jc w:val="both"/>
       </w:pPr>
       <w:r>
         <w:rPr>
@@ -1618,8 +1618,8 @@
     <w:p>
       <w:pPr>
         <w:bidi/>
-        <w:spacing w:after="120" w:line="480" w:lineRule="auto"/>
-        <w:jc w:val="right"/>
+        <w:spacing w:after="120" w:line="360" w:lineRule="auto"/>
+        <w:jc w:val="both"/>
       </w:pPr>
       <w:r>
         <w:rPr>
@@ -1636,8 +1636,8 @@
     <w:p>
       <w:pPr>
         <w:bidi/>
-        <w:spacing w:after="120" w:line="480" w:lineRule="auto"/>
-        <w:jc w:val="right"/>
+        <w:spacing w:after="120" w:line="360" w:lineRule="auto"/>
+        <w:jc w:val="both"/>
       </w:pPr>
       <w:r>
         <w:rPr>
@@ -1654,8 +1654,8 @@
     <w:p>
       <w:pPr>
         <w:bidi/>
-        <w:spacing w:after="120" w:line="480" w:lineRule="auto"/>
-        <w:jc w:val="right"/>
+        <w:spacing w:after="120" w:line="360" w:lineRule="auto"/>
+        <w:jc w:val="both"/>
       </w:pPr>
       <w:r>
         <w:rPr>
@@ -1673,7 +1673,7 @@
       <w:pPr>
         <w:pStyle w:val="Heading3"/>
         <w:bidi/>
-        <w:spacing w:after="140" w:before="220" w:line="480" w:lineRule="auto"/>
+        <w:spacing w:after="140" w:before="220" w:line="360" w:lineRule="auto"/>
         <w:jc w:val="right"/>
       </w:pPr>
       <w:r>
@@ -1692,8 +1692,8 @@
     <w:p>
       <w:pPr>
         <w:bidi/>
-        <w:spacing w:after="120" w:line="480" w:lineRule="auto"/>
-        <w:jc w:val="right"/>
+        <w:spacing w:after="120" w:line="360" w:lineRule="auto"/>
+        <w:jc w:val="both"/>
       </w:pPr>
       <w:r>
         <w:rPr>
@@ -1710,8 +1710,8 @@
     <w:p>
       <w:pPr>
         <w:bidi/>
-        <w:spacing w:after="120" w:line="480" w:lineRule="auto"/>
-        <w:jc w:val="right"/>
+        <w:spacing w:after="120" w:line="360" w:lineRule="auto"/>
+        <w:jc w:val="both"/>
       </w:pPr>
       <w:r>
         <w:rPr>
@@ -1728,8 +1728,8 @@
     <w:p>
       <w:pPr>
         <w:bidi/>
-        <w:spacing w:after="120" w:line="480" w:lineRule="auto"/>
-        <w:jc w:val="right"/>
+        <w:spacing w:after="120" w:line="360" w:lineRule="auto"/>
+        <w:jc w:val="both"/>
       </w:pPr>
       <w:r>
         <w:rPr>
@@ -1747,7 +1747,7 @@
       <w:pPr>
         <w:pStyle w:val="Heading3"/>
         <w:bidi/>
-        <w:spacing w:after="140" w:before="220" w:line="480" w:lineRule="auto"/>
+        <w:spacing w:after="140" w:before="220" w:line="360" w:lineRule="auto"/>
         <w:jc w:val="right"/>
       </w:pPr>
       <w:r>
@@ -1766,8 +1766,8 @@
     <w:p>
       <w:pPr>
         <w:bidi/>
-        <w:spacing w:after="120" w:line="480" w:lineRule="auto"/>
-        <w:jc w:val="right"/>
+        <w:spacing w:after="120" w:line="360" w:lineRule="auto"/>
+        <w:jc w:val="both"/>
       </w:pPr>
       <w:r>
         <w:rPr>
@@ -1784,8 +1784,8 @@
     <w:p>
       <w:pPr>
         <w:bidi/>
-        <w:spacing w:after="120" w:line="480" w:lineRule="auto"/>
-        <w:jc w:val="right"/>
+        <w:spacing w:after="120" w:line="360" w:lineRule="auto"/>
+        <w:jc w:val="both"/>
       </w:pPr>
       <w:r>
         <w:rPr>
@@ -1803,7 +1803,7 @@
       <w:pPr>
         <w:pStyle w:val="Heading2"/>
         <w:bidi/>
-        <w:spacing w:after="180" w:before="280" w:line="480" w:lineRule="auto"/>
+        <w:spacing w:after="180" w:before="280" w:line="360" w:lineRule="auto"/>
         <w:jc w:val="right"/>
       </w:pPr>
       <w:r>
@@ -1822,8 +1822,8 @@
     <w:p>
       <w:pPr>
         <w:bidi/>
-        <w:spacing w:after="120" w:line="480" w:lineRule="auto"/>
-        <w:jc w:val="right"/>
+        <w:spacing w:after="120" w:line="360" w:lineRule="auto"/>
+        <w:jc w:val="both"/>
       </w:pPr>
       <w:r>
         <w:rPr>
@@ -1840,8 +1840,8 @@
     <w:p>
       <w:pPr>
         <w:bidi/>
-        <w:spacing w:after="120" w:line="480" w:lineRule="auto"/>
-        <w:jc w:val="right"/>
+        <w:spacing w:after="120" w:line="360" w:lineRule="auto"/>
+        <w:jc w:val="both"/>
       </w:pPr>
       <w:r>
         <w:rPr>
@@ -1858,8 +1858,8 @@
     <w:p>
       <w:pPr>
         <w:bidi/>
-        <w:spacing w:after="120" w:line="480" w:lineRule="auto"/>
-        <w:jc w:val="right"/>
+        <w:spacing w:after="120" w:line="360" w:lineRule="auto"/>
+        <w:jc w:val="both"/>
       </w:pPr>
       <w:r>
         <w:rPr>
@@ -1882,7 +1882,7 @@
       <w:pPr>
         <w:pStyle w:val="Heading1"/>
         <w:bidi/>
-        <w:spacing w:after="240" w:before="360" w:line="480" w:lineRule="auto"/>
+        <w:spacing w:after="240" w:before="360" w:line="360" w:lineRule="auto"/>
         <w:jc w:val="right"/>
       </w:pPr>
       <w:r>
@@ -1901,8 +1901,8 @@
     <w:p>
       <w:pPr>
         <w:bidi/>
-        <w:spacing w:after="120" w:line="480" w:lineRule="auto"/>
-        <w:jc w:val="right"/>
+        <w:spacing w:after="120" w:line="360" w:lineRule="auto"/>
+        <w:jc w:val="both"/>
       </w:pPr>
       <w:r>
         <w:rPr>
@@ -1919,8 +1919,8 @@
     <w:p>
       <w:pPr>
         <w:bidi/>
-        <w:spacing w:after="120" w:line="480" w:lineRule="auto"/>
-        <w:jc w:val="right"/>
+        <w:spacing w:after="120" w:line="360" w:lineRule="auto"/>
+        <w:jc w:val="both"/>
       </w:pPr>
       <w:r>
         <w:rPr>
@@ -1937,8 +1937,8 @@
     <w:p>
       <w:pPr>
         <w:bidi/>
-        <w:spacing w:after="120" w:line="480" w:lineRule="auto"/>
-        <w:jc w:val="right"/>
+        <w:spacing w:after="120" w:line="360" w:lineRule="auto"/>
+        <w:jc w:val="both"/>
       </w:pPr>
       <w:r>
         <w:rPr>
@@ -1955,8 +1955,8 @@
     <w:p>
       <w:pPr>
         <w:bidi/>
-        <w:spacing w:after="120" w:line="480" w:lineRule="auto"/>
-        <w:jc w:val="right"/>
+        <w:spacing w:after="120" w:line="360" w:lineRule="auto"/>
+        <w:jc w:val="both"/>
       </w:pPr>
       <w:r>
         <w:rPr>
@@ -1973,8 +1973,8 @@
     <w:p>
       <w:pPr>
         <w:bidi/>
-        <w:spacing w:after="120" w:line="480" w:lineRule="auto"/>
-        <w:jc w:val="right"/>
+        <w:spacing w:after="120" w:line="360" w:lineRule="auto"/>
+        <w:jc w:val="both"/>
       </w:pPr>
       <w:r>
         <w:rPr>
@@ -1991,8 +1991,8 @@
     <w:p>
       <w:pPr>
         <w:bidi/>
-        <w:spacing w:after="120" w:line="480" w:lineRule="auto"/>
-        <w:jc w:val="right"/>
+        <w:spacing w:after="120" w:line="360" w:lineRule="auto"/>
+        <w:jc w:val="both"/>
       </w:pPr>
       <w:r>
         <w:rPr>
@@ -2015,7 +2015,7 @@
       <w:pPr>
         <w:pStyle w:val="Heading1"/>
         <w:bidi/>
-        <w:spacing w:after="240" w:before="360" w:line="480" w:lineRule="auto"/>
+        <w:spacing w:after="240" w:before="360" w:line="360" w:lineRule="auto"/>
         <w:jc w:val="right"/>
       </w:pPr>
       <w:r>
@@ -2034,9 +2034,9 @@
     <w:p>
       <w:pPr>
         <w:bidi/>
-        <w:spacing w:after="160" w:line="480" w:lineRule="auto"/>
+        <w:spacing w:after="160" w:line="360" w:lineRule="auto"/>
         <w:ind w:left="720" w:hanging="720"/>
-        <w:jc w:val="right"/>
+        <w:jc w:val="both"/>
       </w:pPr>
       <w:r>
         <w:rPr>
@@ -2053,9 +2053,9 @@
     <w:p>
       <w:pPr>
         <w:bidi/>
-        <w:spacing w:after="160" w:line="480" w:lineRule="auto"/>
+        <w:spacing w:after="160" w:line="360" w:lineRule="auto"/>
         <w:ind w:left="720" w:hanging="720"/>
-        <w:jc w:val="right"/>
+        <w:jc w:val="both"/>
       </w:pPr>
       <w:r>
         <w:rPr>
@@ -2072,9 +2072,9 @@
     <w:p>
       <w:pPr>
         <w:bidi/>
-        <w:spacing w:after="160" w:line="480" w:lineRule="auto"/>
+        <w:spacing w:after="160" w:line="360" w:lineRule="auto"/>
         <w:ind w:left="720" w:hanging="720"/>
-        <w:jc w:val="right"/>
+        <w:jc w:val="both"/>
       </w:pPr>
       <w:r>
         <w:rPr>
@@ -2091,9 +2091,9 @@
     <w:p>
       <w:pPr>
         <w:bidi/>
-        <w:spacing w:after="160" w:line="480" w:lineRule="auto"/>
+        <w:spacing w:after="160" w:line="360" w:lineRule="auto"/>
         <w:ind w:left="720" w:hanging="720"/>
-        <w:jc w:val="right"/>
+        <w:jc w:val="both"/>
       </w:pPr>
       <w:r>
         <w:rPr>
@@ -2110,9 +2110,9 @@
     <w:p>
       <w:pPr>
         <w:bidi/>
-        <w:spacing w:after="160" w:line="480" w:lineRule="auto"/>
+        <w:spacing w:after="160" w:line="360" w:lineRule="auto"/>
         <w:ind w:left="720" w:hanging="720"/>
-        <w:jc w:val="right"/>
+        <w:jc w:val="both"/>
       </w:pPr>
       <w:r>
         <w:rPr>
@@ -2129,9 +2129,9 @@
     <w:p>
       <w:pPr>
         <w:bidi/>
-        <w:spacing w:after="160" w:line="480" w:lineRule="auto"/>
+        <w:spacing w:after="160" w:line="360" w:lineRule="auto"/>
         <w:ind w:left="720" w:hanging="720"/>
-        <w:jc w:val="right"/>
+        <w:jc w:val="both"/>
       </w:pPr>
       <w:r>
         <w:rPr>
@@ -2148,9 +2148,9 @@
     <w:p>
       <w:pPr>
         <w:bidi/>
-        <w:spacing w:after="160" w:line="480" w:lineRule="auto"/>
+        <w:spacing w:after="160" w:line="360" w:lineRule="auto"/>
         <w:ind w:left="720" w:hanging="720"/>
-        <w:jc w:val="right"/>
+        <w:jc w:val="both"/>
       </w:pPr>
       <w:r>
         <w:rPr>
@@ -2167,7 +2167,7 @@
     <w:p>
       <w:pPr>
         <w:bidi w:val="false"/>
-        <w:spacing w:after="160" w:line="480" w:lineRule="auto"/>
+        <w:spacing w:after="160" w:line="360" w:lineRule="auto"/>
         <w:ind w:left="720" w:hanging="720"/>
         <w:jc w:val="left"/>
       </w:pPr>
@@ -2211,7 +2211,7 @@
     <w:p>
       <w:pPr>
         <w:bidi w:val="false"/>
-        <w:spacing w:after="160" w:line="480" w:lineRule="auto"/>
+        <w:spacing w:after="160" w:line="360" w:lineRule="auto"/>
         <w:ind w:left="720" w:hanging="720"/>
         <w:jc w:val="left"/>
       </w:pPr>
@@ -2255,7 +2255,7 @@
     <w:p>
       <w:pPr>
         <w:bidi w:val="false"/>
-        <w:spacing w:after="160" w:line="480" w:lineRule="auto"/>
+        <w:spacing w:after="160" w:line="360" w:lineRule="auto"/>
         <w:ind w:left="720" w:hanging="720"/>
         <w:jc w:val="left"/>
       </w:pPr>
@@ -2299,7 +2299,7 @@
     <w:p>
       <w:pPr>
         <w:bidi w:val="false"/>
-        <w:spacing w:after="160" w:line="480" w:lineRule="auto"/>
+        <w:spacing w:after="160" w:line="360" w:lineRule="auto"/>
         <w:ind w:left="720" w:hanging="720"/>
         <w:jc w:val="left"/>
       </w:pPr>
@@ -2343,7 +2343,7 @@
     <w:p>
       <w:pPr>
         <w:bidi w:val="false"/>
-        <w:spacing w:after="160" w:line="480" w:lineRule="auto"/>
+        <w:spacing w:after="160" w:line="360" w:lineRule="auto"/>
         <w:ind w:left="720" w:hanging="720"/>
         <w:jc w:val="left"/>
       </w:pPr>
@@ -2387,7 +2387,7 @@
     <w:p>
       <w:pPr>
         <w:bidi w:val="false"/>
-        <w:spacing w:after="160" w:line="480" w:lineRule="auto"/>
+        <w:spacing w:after="160" w:line="360" w:lineRule="auto"/>
         <w:ind w:left="720" w:hanging="720"/>
         <w:jc w:val="left"/>
       </w:pPr>
@@ -2431,7 +2431,7 @@
     <w:p>
       <w:pPr>
         <w:bidi w:val="false"/>
-        <w:spacing w:after="160" w:line="480" w:lineRule="auto"/>
+        <w:spacing w:after="160" w:line="360" w:lineRule="auto"/>
         <w:ind w:left="720" w:hanging="720"/>
         <w:jc w:val="left"/>
       </w:pPr>
@@ -2475,7 +2475,7 @@
     <w:p>
       <w:pPr>
         <w:bidi w:val="false"/>
-        <w:spacing w:after="160" w:line="480" w:lineRule="auto"/>
+        <w:spacing w:after="160" w:line="360" w:lineRule="auto"/>
         <w:ind w:left="720" w:hanging="720"/>
         <w:jc w:val="left"/>
       </w:pPr>
@@ -2519,7 +2519,7 @@
     <w:p>
       <w:pPr>
         <w:bidi w:val="false"/>
-        <w:spacing w:after="160" w:line="480" w:lineRule="auto"/>
+        <w:spacing w:after="160" w:line="360" w:lineRule="auto"/>
         <w:ind w:left="720" w:hanging="720"/>
         <w:jc w:val="left"/>
       </w:pPr>
@@ -2563,7 +2563,7 @@
     <w:p>
       <w:pPr>
         <w:bidi w:val="false"/>
-        <w:spacing w:after="160" w:line="480" w:lineRule="auto"/>
+        <w:spacing w:after="160" w:line="360" w:lineRule="auto"/>
         <w:ind w:left="720" w:hanging="720"/>
         <w:jc w:val="left"/>
       </w:pPr>
@@ -2607,7 +2607,7 @@
     <w:p>
       <w:pPr>
         <w:bidi w:val="false"/>
-        <w:spacing w:after="160" w:line="480" w:lineRule="auto"/>
+        <w:spacing w:after="160" w:line="360" w:lineRule="auto"/>
         <w:ind w:left="720" w:hanging="720"/>
         <w:jc w:val="left"/>
       </w:pPr>
@@ -2651,7 +2651,7 @@
     <w:p>
       <w:pPr>
         <w:bidi w:val="false"/>
-        <w:spacing w:after="160" w:line="480" w:lineRule="auto"/>
+        <w:spacing w:after="160" w:line="360" w:lineRule="auto"/>
         <w:ind w:left="720" w:hanging="720"/>
         <w:jc w:val="left"/>
       </w:pPr>
@@ -2695,7 +2695,7 @@
     <w:p>
       <w:pPr>
         <w:bidi w:val="false"/>
-        <w:spacing w:after="160" w:line="480" w:lineRule="auto"/>
+        <w:spacing w:after="160" w:line="360" w:lineRule="auto"/>
         <w:ind w:left="720" w:hanging="720"/>
         <w:jc w:val="left"/>
       </w:pPr>
@@ -2739,7 +2739,7 @@
     <w:p>
       <w:pPr>
         <w:bidi w:val="false"/>
-        <w:spacing w:after="160" w:line="480" w:lineRule="auto"/>
+        <w:spacing w:after="160" w:line="360" w:lineRule="auto"/>
         <w:ind w:left="720" w:hanging="720"/>
         <w:jc w:val="left"/>
       </w:pPr>
@@ -2783,7 +2783,7 @@
     <w:p>
       <w:pPr>
         <w:bidi w:val="false"/>
-        <w:spacing w:after="160" w:line="480" w:lineRule="auto"/>
+        <w:spacing w:after="160" w:line="360" w:lineRule="auto"/>
         <w:ind w:left="720" w:hanging="720"/>
         <w:jc w:val="left"/>
       </w:pPr>
@@ -2827,7 +2827,7 @@
     <w:p>
       <w:pPr>
         <w:bidi w:val="false"/>
-        <w:spacing w:after="160" w:line="480" w:lineRule="auto"/>
+        <w:spacing w:after="160" w:line="360" w:lineRule="auto"/>
         <w:ind w:left="720" w:hanging="720"/>
         <w:jc w:val="left"/>
       </w:pPr>
@@ -2871,7 +2871,7 @@
     <w:p>
       <w:pPr>
         <w:bidi w:val="false"/>
-        <w:spacing w:after="160" w:line="480" w:lineRule="auto"/>
+        <w:spacing w:after="160" w:line="360" w:lineRule="auto"/>
         <w:ind w:left="720" w:hanging="720"/>
         <w:jc w:val="left"/>
       </w:pPr>
@@ -2915,7 +2915,7 @@
     <w:p>
       <w:pPr>
         <w:bidi w:val="false"/>
-        <w:spacing w:after="160" w:line="480" w:lineRule="auto"/>
+        <w:spacing w:after="160" w:line="360" w:lineRule="auto"/>
         <w:ind w:left="720" w:hanging="720"/>
         <w:jc w:val="left"/>
       </w:pPr>
@@ -2959,7 +2959,7 @@
     <w:p>
       <w:pPr>
         <w:bidi w:val="false"/>
-        <w:spacing w:after="160" w:line="480" w:lineRule="auto"/>
+        <w:spacing w:after="160" w:line="360" w:lineRule="auto"/>
         <w:ind w:left="720" w:hanging="720"/>
         <w:jc w:val="left"/>
       </w:pPr>
@@ -3003,7 +3003,7 @@
     <w:p>
       <w:pPr>
         <w:bidi w:val="false"/>
-        <w:spacing w:after="160" w:line="480" w:lineRule="auto"/>
+        <w:spacing w:after="160" w:line="360" w:lineRule="auto"/>
         <w:ind w:left="720" w:hanging="720"/>
         <w:jc w:val="left"/>
       </w:pPr>
@@ -3047,7 +3047,7 @@
     <w:p>
       <w:pPr>
         <w:bidi w:val="false"/>
-        <w:spacing w:after="160" w:line="480" w:lineRule="auto"/>
+        <w:spacing w:after="160" w:line="360" w:lineRule="auto"/>
         <w:ind w:left="720" w:hanging="720"/>
         <w:jc w:val="left"/>
       </w:pPr>
@@ -3091,7 +3091,7 @@
     <w:p>
       <w:pPr>
         <w:bidi w:val="false"/>
-        <w:spacing w:after="160" w:line="480" w:lineRule="auto"/>
+        <w:spacing w:after="160" w:line="360" w:lineRule="auto"/>
         <w:ind w:left="720" w:hanging="720"/>
         <w:jc w:val="left"/>
       </w:pPr>
@@ -3141,7 +3141,7 @@
       <w:pPr>
         <w:pStyle w:val="Heading1"/>
         <w:bidi/>
-        <w:spacing w:after="240" w:before="360" w:line="480" w:lineRule="auto"/>
+        <w:spacing w:after="240" w:before="360" w:line="360" w:lineRule="auto"/>
         <w:jc w:val="right"/>
       </w:pPr>
       <w:r>
@@ -3161,7 +3161,7 @@
       <w:pPr>
         <w:pStyle w:val="Heading2"/>
         <w:bidi/>
-        <w:spacing w:after="180" w:before="280" w:line="480" w:lineRule="auto"/>
+        <w:spacing w:after="180" w:before="280" w:line="360" w:lineRule="auto"/>
         <w:jc w:val="right"/>
       </w:pPr>
       <w:r>
@@ -3180,8 +3180,8 @@
     <w:p>
       <w:pPr>
         <w:bidi/>
-        <w:spacing w:after="120" w:line="480" w:lineRule="auto"/>
-        <w:jc w:val="right"/>
+        <w:spacing w:after="120" w:line="360" w:lineRule="auto"/>
+        <w:jc w:val="both"/>
       </w:pPr>
       <w:r>
         <w:rPr>
@@ -3199,7 +3199,7 @@
       <w:pPr>
         <w:pStyle w:val="Heading3"/>
         <w:bidi/>
-        <w:spacing w:after="140" w:before="220" w:line="480" w:lineRule="auto"/>
+        <w:spacing w:after="140" w:before="220" w:line="360" w:lineRule="auto"/>
         <w:jc w:val="right"/>
       </w:pPr>
       <w:r>
@@ -3218,7 +3218,7 @@
     <w:p>
       <w:pPr>
         <w:bidi/>
-        <w:spacing w:after="120" w:line="480" w:lineRule="auto"/>
+        <w:spacing w:after="120" w:line="360" w:lineRule="auto"/>
         <w:jc w:val="right"/>
       </w:pPr>
       <w:r>
@@ -3235,8 +3235,8 @@
     <w:p>
       <w:pPr>
         <w:bidi/>
-        <w:spacing w:after="120" w:line="480" w:lineRule="auto"/>
-        <w:jc w:val="right"/>
+        <w:spacing w:after="120" w:line="360" w:lineRule="auto"/>
+        <w:jc w:val="both"/>
       </w:pPr>
       <w:r>
         <w:rPr>
@@ -3254,7 +3254,7 @@
       <w:pPr>
         <w:pStyle w:val="Heading3"/>
         <w:bidi/>
-        <w:spacing w:after="140" w:before="220" w:line="480" w:lineRule="auto"/>
+        <w:spacing w:after="140" w:before="220" w:line="360" w:lineRule="auto"/>
         <w:jc w:val="right"/>
       </w:pPr>
       <w:r>
@@ -3273,7 +3273,7 @@
     <w:p>
       <w:pPr>
         <w:bidi/>
-        <w:spacing w:after="120" w:line="480" w:lineRule="auto"/>
+        <w:spacing w:after="120" w:line="360" w:lineRule="auto"/>
         <w:jc w:val="right"/>
       </w:pPr>
       <w:r>
@@ -3290,8 +3290,8 @@
     <w:p>
       <w:pPr>
         <w:bidi/>
-        <w:spacing w:after="120" w:line="480" w:lineRule="auto"/>
-        <w:jc w:val="right"/>
+        <w:spacing w:after="120" w:line="360" w:lineRule="auto"/>
+        <w:jc w:val="both"/>
       </w:pPr>
       <w:r>
         <w:rPr>
@@ -3309,7 +3309,7 @@
       <w:pPr>
         <w:pStyle w:val="Heading3"/>
         <w:bidi/>
-        <w:spacing w:after="140" w:before="220" w:line="480" w:lineRule="auto"/>
+        <w:spacing w:after="140" w:before="220" w:line="360" w:lineRule="auto"/>
         <w:jc w:val="right"/>
       </w:pPr>
       <w:r>
@@ -3328,7 +3328,7 @@
     <w:p>
       <w:pPr>
         <w:bidi/>
-        <w:spacing w:after="120" w:line="480" w:lineRule="auto"/>
+        <w:spacing w:after="120" w:line="360" w:lineRule="auto"/>
         <w:jc w:val="right"/>
       </w:pPr>
       <w:r>
@@ -3345,8 +3345,8 @@
     <w:p>
       <w:pPr>
         <w:bidi/>
-        <w:spacing w:after="120" w:line="480" w:lineRule="auto"/>
-        <w:jc w:val="right"/>
+        <w:spacing w:after="120" w:line="360" w:lineRule="auto"/>
+        <w:jc w:val="both"/>
       </w:pPr>
       <w:r>
         <w:rPr>
@@ -3369,7 +3369,7 @@
       <w:pPr>
         <w:pStyle w:val="Heading2"/>
         <w:bidi/>
-        <w:spacing w:after="180" w:before="280" w:line="480" w:lineRule="auto"/>
+        <w:spacing w:after="180" w:before="280" w:line="360" w:lineRule="auto"/>
         <w:jc w:val="right"/>
       </w:pPr>
       <w:r>
@@ -3388,8 +3388,8 @@
     <w:p>
       <w:pPr>
         <w:bidi/>
-        <w:spacing w:after="120" w:line="480" w:lineRule="auto"/>
-        <w:jc w:val="right"/>
+        <w:spacing w:after="120" w:line="360" w:lineRule="auto"/>
+        <w:jc w:val="both"/>
       </w:pPr>
       <w:r>
         <w:rPr>
@@ -3406,8 +3406,8 @@
     <w:p>
       <w:pPr>
         <w:bidi/>
-        <w:spacing w:after="120" w:line="480" w:lineRule="auto"/>
-        <w:jc w:val="right"/>
+        <w:spacing w:after="120" w:line="360" w:lineRule="auto"/>
+        <w:jc w:val="both"/>
       </w:pPr>
       <w:r>
         <w:rPr>
@@ -3447,8 +3447,8 @@
     <w:p>
       <w:pPr>
         <w:bidi/>
-        <w:spacing w:after="120" w:line="480" w:lineRule="auto"/>
-        <w:jc w:val="right"/>
+        <w:spacing w:after="120" w:line="360" w:lineRule="auto"/>
+        <w:jc w:val="both"/>
       </w:pPr>
       <w:r>
         <w:rPr>
@@ -3465,8 +3465,8 @@
     <w:p>
       <w:pPr>
         <w:bidi/>
-        <w:spacing w:after="120" w:line="480" w:lineRule="auto"/>
-        <w:jc w:val="right"/>
+        <w:spacing w:after="120" w:line="360" w:lineRule="auto"/>
+        <w:jc w:val="both"/>
       </w:pPr>
       <w:r>
         <w:rPr>
@@ -3483,8 +3483,8 @@
     <w:p>
       <w:pPr>
         <w:bidi/>
-        <w:spacing w:after="120" w:line="480" w:lineRule="auto"/>
-        <w:jc w:val="right"/>
+        <w:spacing w:after="120" w:line="360" w:lineRule="auto"/>
+        <w:jc w:val="both"/>
       </w:pPr>
       <w:r>
         <w:rPr>
@@ -3501,8 +3501,8 @@
     <w:p>
       <w:pPr>
         <w:bidi/>
-        <w:spacing w:after="120" w:line="480" w:lineRule="auto"/>
-        <w:jc w:val="right"/>
+        <w:spacing w:after="120" w:line="360" w:lineRule="auto"/>
+        <w:jc w:val="both"/>
       </w:pPr>
       <w:r>
         <w:rPr>
@@ -3519,8 +3519,8 @@
     <w:p>
       <w:pPr>
         <w:bidi/>
-        <w:spacing w:after="120" w:line="480" w:lineRule="auto"/>
-        <w:jc w:val="right"/>
+        <w:spacing w:after="120" w:line="360" w:lineRule="auto"/>
+        <w:jc w:val="both"/>
       </w:pPr>
       <w:r>
         <w:rPr>
@@ -3537,8 +3537,8 @@
     <w:p>
       <w:pPr>
         <w:bidi/>
-        <w:spacing w:after="120" w:line="480" w:lineRule="auto"/>
-        <w:jc w:val="right"/>
+        <w:spacing w:after="120" w:line="360" w:lineRule="auto"/>
+        <w:jc w:val="both"/>
       </w:pPr>
       <w:r>
         <w:rPr>
@@ -3578,8 +3578,8 @@
     <w:p>
       <w:pPr>
         <w:bidi/>
-        <w:spacing w:after="120" w:line="480" w:lineRule="auto"/>
-        <w:jc w:val="right"/>
+        <w:spacing w:after="120" w:line="360" w:lineRule="auto"/>
+        <w:jc w:val="both"/>
       </w:pPr>
       <w:r>
         <w:rPr>
@@ -3619,8 +3619,8 @@
     <w:p>
       <w:pPr>
         <w:bidi/>
-        <w:spacing w:after="120" w:line="480" w:lineRule="auto"/>
-        <w:jc w:val="right"/>
+        <w:spacing w:after="120" w:line="360" w:lineRule="auto"/>
+        <w:jc w:val="both"/>
       </w:pPr>
       <w:r>
         <w:rPr>
@@ -3637,8 +3637,8 @@
     <w:p>
       <w:pPr>
         <w:bidi/>
-        <w:spacing w:after="120" w:line="480" w:lineRule="auto"/>
-        <w:jc w:val="right"/>
+        <w:spacing w:after="120" w:line="360" w:lineRule="auto"/>
+        <w:jc w:val="both"/>
       </w:pPr>
       <w:r>
         <w:rPr>
@@ -3655,8 +3655,8 @@
     <w:p>
       <w:pPr>
         <w:bidi/>
-        <w:spacing w:after="120" w:line="480" w:lineRule="auto"/>
-        <w:jc w:val="right"/>
+        <w:spacing w:after="120" w:line="360" w:lineRule="auto"/>
+        <w:jc w:val="both"/>
       </w:pPr>
       <w:r>
         <w:rPr>
@@ -3679,7 +3679,7 @@
       <w:pPr>
         <w:pStyle w:val="Heading2"/>
         <w:bidi/>
-        <w:spacing w:after="180" w:before="280" w:line="480" w:lineRule="auto"/>
+        <w:spacing w:after="180" w:before="280" w:line="360" w:lineRule="auto"/>
         <w:jc w:val="right"/>
       </w:pPr>
       <w:r>
@@ -3698,8 +3698,8 @@
     <w:p>
       <w:pPr>
         <w:bidi/>
-        <w:spacing w:after="120" w:line="480" w:lineRule="auto"/>
-        <w:jc w:val="right"/>
+        <w:spacing w:after="120" w:line="360" w:lineRule="auto"/>
+        <w:jc w:val="both"/>
       </w:pPr>
       <w:r>
         <w:rPr>
@@ -3716,8 +3716,8 @@
     <w:p>
       <w:pPr>
         <w:bidi/>
-        <w:spacing w:after="120" w:line="480" w:lineRule="auto"/>
-        <w:jc w:val="right"/>
+        <w:spacing w:after="120" w:line="360" w:lineRule="auto"/>
+        <w:jc w:val="both"/>
       </w:pPr>
       <w:r>
         <w:rPr>
@@ -3734,8 +3734,8 @@
     <w:p>
       <w:pPr>
         <w:bidi/>
-        <w:spacing w:after="120" w:line="480" w:lineRule="auto"/>
-        <w:jc w:val="right"/>
+        <w:spacing w:after="120" w:line="360" w:lineRule="auto"/>
+        <w:jc w:val="both"/>
       </w:pPr>
       <w:r>
         <w:rPr>

</xml_diff>

<commit_message>
Expand findings, discussion and summary; number chapters; integrative discussion
Findings chapter enriched with additional transcript material
(imagination as fear source, limits of knowing, negotiation over
habituation, sibling anecdotes, counter-hypotheses, wonder about the
shadow's nature). Discussion rewritten as one continuous integrative
essay without subsections, weaving analysis, interpretation and the
answers to the three research questions, with an added paragraph on the
children's metaphysical excursions. Summary expanded with fuller
learnings, applied recommendations and contribution. Chapters and
subchapters numbered (1, 2, 2.1-2.4, 3, 3.1-3.5, 4, 4.1-4.5, 5, 6).

Co-Authored-By: Claude Fable 5 <noreply@anthropic.com>
Claude-Session: https://claude.ai/code/session_01LwWT2RXpwEyndDcP4wd3kJ
</commit_message>
<xml_diff>
--- a/seminar/seminar.docx
+++ b/seminar/seminar.docx
@@ -290,7 +290,7 @@
           <w:szCs w:val="32"/>
           <w:rtl/>
         </w:rPr>
-        <w:t xml:space="preserve">מבוא</w:t>
+        <w:t xml:space="preserve">1. מבוא</w:t>
       </w:r>
     </w:p>
     <w:p>
@@ -369,7 +369,7 @@
           <w:szCs w:val="32"/>
           <w:rtl/>
         </w:rPr>
-        <w:t xml:space="preserve">סקירת ספרות</w:t>
+        <w:t xml:space="preserve">2. סקירת ספרות</w:t>
       </w:r>
     </w:p>
     <w:p>
@@ -407,7 +407,7 @@
           <w:szCs w:val="28"/>
           <w:rtl/>
         </w:rPr>
-        <w:t xml:space="preserve">פילוסופיה לילדים ופילוסופיה עם ילדים: רקע היסטורי ופילוסופי-פדגוגי</w:t>
+        <w:t xml:space="preserve">2.1 פילוסופיה לילדים ופילוסופיה עם ילדים: רקע היסטורי ופילוסופי-פדגוגי</w:t>
       </w:r>
     </w:p>
     <w:p>
@@ -499,7 +499,7 @@
           <w:szCs w:val="28"/>
           <w:rtl/>
         </w:rPr>
-        <w:t xml:space="preserve">קהילת החקר הפילוסופית: עקרונות, מהלך ותפקיד המנחה</w:t>
+        <w:t xml:space="preserve">2.2 קהילת החקר הפילוסופית: עקרונות, מהלך ותפקיד המנחה</w:t>
       </w:r>
     </w:p>
     <w:p>
@@ -591,7 +591,7 @@
           <w:szCs w:val="28"/>
           <w:rtl/>
         </w:rPr>
-        <w:t xml:space="preserve">רגישות פילוסופית, שאלות קיומיות וחיפוש משמעות בגיל הצעיר</w:t>
+        <w:t xml:space="preserve">2.3 רגישות פילוסופית, שאלות קיומיות וחיפוש משמעות בגיל הצעיר</w:t>
       </w:r>
     </w:p>
     <w:p>
@@ -665,7 +665,7 @@
           <w:szCs w:val="28"/>
           <w:rtl/>
         </w:rPr>
-        <w:t xml:space="preserve">רגשות ופחד בקהילת החקר הפילוסופית</w:t>
+        <w:t xml:space="preserve">2.4 רגשות ופחד בקהילת החקר הפילוסופית</w:t>
       </w:r>
     </w:p>
     <w:p>
@@ -762,7 +762,7 @@
           <w:szCs w:val="32"/>
           <w:rtl/>
         </w:rPr>
-        <w:t xml:space="preserve">פרק מתודולוגי</w:t>
+        <w:t xml:space="preserve">3. פרק מתודולוגי</w:t>
       </w:r>
     </w:p>
     <w:p>
@@ -782,7 +782,7 @@
           <w:szCs w:val="28"/>
           <w:rtl/>
         </w:rPr>
-        <w:t xml:space="preserve">שיטת המחקר</w:t>
+        <w:t xml:space="preserve">3.1 שיטת המחקר</w:t>
       </w:r>
     </w:p>
     <w:p>
@@ -820,7 +820,7 @@
           <w:szCs w:val="28"/>
           <w:rtl/>
         </w:rPr>
-        <w:t xml:space="preserve">אוכלוסיית המחקר</w:t>
+        <w:t xml:space="preserve">3.2 אוכלוסיית המחקר</w:t>
       </w:r>
     </w:p>
     <w:p>
@@ -858,7 +858,7 @@
           <w:szCs w:val="28"/>
           <w:rtl/>
         </w:rPr>
-        <w:t xml:space="preserve">הליך המחקר ואיסוף הנתונים</w:t>
+        <w:t xml:space="preserve">3.3 הליך המחקר ואיסוף הנתונים</w:t>
       </w:r>
     </w:p>
     <w:p>
@@ -932,7 +932,7 @@
           <w:szCs w:val="28"/>
           <w:rtl/>
         </w:rPr>
-        <w:t xml:space="preserve">עיבוד הנתונים</w:t>
+        <w:t xml:space="preserve">3.4 עיבוד הנתונים</w:t>
       </w:r>
     </w:p>
     <w:p>
@@ -970,7 +970,7 @@
           <w:szCs w:val="28"/>
           <w:rtl/>
         </w:rPr>
-        <w:t xml:space="preserve">שאלות המחקר</w:t>
+        <w:t xml:space="preserve">3.5 שאלות המחקר</w:t>
       </w:r>
     </w:p>
     <w:p>
@@ -1067,7 +1067,7 @@
           <w:szCs w:val="32"/>
           <w:rtl/>
         </w:rPr>
-        <w:t xml:space="preserve">פרק הממצאים</w:t>
+        <w:t xml:space="preserve">4. פרק הממצאים</w:t>
       </w:r>
     </w:p>
     <w:p>
@@ -1105,7 +1105,7 @@
           <w:szCs w:val="28"/>
           <w:rtl/>
         </w:rPr>
-        <w:t xml:space="preserve">"מה יש בתוכך?": הפחד מן הלא-נודע</w:t>
+        <w:t xml:space="preserve">4.1 "מה יש בתוכך?": הפחד מן הלא-נודע</w:t>
       </w:r>
     </w:p>
     <w:p>
@@ -1159,7 +1159,25 @@
           <w:szCs w:val="24"/>
           <w:rtl/>
         </w:rPr>
-        <w:t xml:space="preserve">במפגש השלישי, סביב סיפור "לילא והחושך", חזר אותו רעיון בתוספת ממד הבדידות. מאג'ד אמר: "החושך מפחיד אותך כשאתה לבד, אז תפחד מאוד. אתה צריך אור קטן שיילך איתך", וסאמר הוסיף: "בלי אור אפשר ליפול, ואפשר לפחד מהחושך". דברים אלה מלמדים שהילדים אינם תופסים את הפחד כתגובה לעצם מאיים, אלא כתגובה למצב של אי-ידיעה: מה שאינו נראה ואינו מוכר, ממנו פוחדים.</w:t>
+        <w:t xml:space="preserve">לצד הלא-נודע הופיע בדברי הילדים גם הדמיון כמקור פחד: אל תוך הקופסה הסגורה והצל חסר השם השליכו הילדים דמויות מאיימות. הם דיברו על מפלצת, על וחש (מפלצת בערבית) שאולי מסתתר בצל, ועל "משהו מפחיד" שממלא את הקופסה כל עוד היא סגורה. דווקא הפער בין הדמיון לממצאות הצחיק אותם בדיעבד: מה שדומיין כמפלצת התגלה ככדור משחק, ומה שדומיין כווחש התגלה כצל של העכבר עצמו.</w:t>
+      </w:r>
+    </w:p>
+    <w:p>
+      <w:pPr>
+        <w:bidi/>
+        <w:spacing w:after="120" w:line="360" w:lineRule="auto"/>
+        <w:jc w:val="both"/>
+      </w:pPr>
+      <w:r>
+        <w:rPr>
+          <w:rFonts w:ascii="David" w:cs="David" w:eastAsia="David" w:hAnsi="David"/>
+          <w:b w:val="false"/>
+          <w:i w:val="false"/>
+          <w:sz w:val="24"/>
+          <w:szCs w:val="24"/>
+          <w:rtl/>
+        </w:rPr>
+        <w:t xml:space="preserve">במפגש השלישי, סביב סיפור "לילא והחושך", חזר אותו רעיון בתוספת ממד הבדידות. מאג'ד אמר: "החושך מפחיד אותך כשאתה לבד, אז תפחד מאוד. אתה צריך אור קטן שיילך איתך", וסאמר הוסיף: "בלי אור אפשר ליפול, ואפשר לפחד מהחושך". ילדה אחת חידדה את התנאים: "כשעוד מכבים את האור, וכשכל הבית חשוך לגמרי, ואני לבד, אני מפחדת. מפחדת מאוד". דברים אלה מלמדים שהילדים אינם תופסים את הפחד כתגובה לעצם מאיים, אלא כתגובה למצב של אי-ידיעה: מה שאינו נראה ואינו מוכר, ממנו פוחדים, והבדידות מעצימה את המצב הזה, שכן אין איש שיראה בשבילך.</w:t>
       </w:r>
     </w:p>
     <w:p>
@@ -1179,7 +1197,7 @@
           <w:szCs w:val="28"/>
           <w:rtl/>
         </w:rPr>
-        <w:t xml:space="preserve">"רק האור נעלם": הידיעה והגילוי כמפיגי פחד</w:t>
+        <w:t xml:space="preserve">4.2 "רק האור נעלם": הידיעה והגילוי כמפיגי פחד</w:t>
       </w:r>
     </w:p>
     <w:p>
@@ -1253,6 +1271,24 @@
           <w:rtl/>
         </w:rPr>
         <w:t xml:space="preserve">רעיון דומה עלה במפגש השני, על "העכבר והצל". רימא סיפרה: "פעם יצאתי החוצה וראיתי צל, ואמרתי: מהצל הזה אני לא אפחד, כי כבר בפעם הראשונה ראיתי שזה צל וידעתי מה זה". ילד נוסף ניסח את התהליך ההכרתי שבין ראייה להבנה: "כשאתה רואה משהו עוד פעם, אתה חושב עליו. בפעם הבאה הוא כבר נכנס לך לשכל". במפגש הראשון אמר סאמר על החתול: "הוא יתרגל לקופסה ויראה שאין בה שום דבר". הילדים ניסחו כאן, איש איש בדרכו, את הרעיון שהפחד תלוי בפירוש שאנו נותנים לדברים. החתול חשב שיש דבר מפחיד ומצא צעצוע, והעכבר, כלשון הסיפור שהילדים חזרו עליה בצחוק, "פחד מעצמו".</w:t>
+      </w:r>
+    </w:p>
+    <w:p>
+      <w:pPr>
+        <w:bidi/>
+        <w:spacing w:after="120" w:line="360" w:lineRule="auto"/>
+        <w:jc w:val="both"/>
+      </w:pPr>
+      <w:r>
+        <w:rPr>
+          <w:rFonts w:ascii="David" w:cs="David" w:eastAsia="David" w:hAnsi="David"/>
+          <w:b w:val="false"/>
+          <w:i w:val="false"/>
+          <w:sz w:val="24"/>
+          <w:szCs w:val="24"/>
+          <w:rtl/>
+        </w:rPr>
+        <w:t xml:space="preserve">עם זאת, הילדים לא קיבלו את כוחה של הידיעה כפתרון גורף, והציבו לו גבול. אחד הילדים העיד שהוא עדיין פוחד: "אני מפחד מהחושך כשיש סביבי הרבה דברים. כשמכבים את האור לגמרי, ואני לבד, אני מפחד מאוד", וזאת אף שגם הוא יודע היטב שהחדר נשאר אותו חדר. עדות זו העמידה מול הכלל שניסחו חבריו מקרה נגדי חשוב: הידיעה מפיגה את הפחד, אבל לא תמיד ולא אצל כולם, ובמצבים של בדידות גמורה הידיעה לבדה אינה מספיקה. הילדים לא יישבו את הסתירה, אך עצם הצבתה זה מול זה, כלל וחריג לו, היא חלק מהחקירה שקיימו.</w:t>
       </w:r>
     </w:p>
     <w:p>
@@ -1272,7 +1308,7 @@
           <w:szCs w:val="28"/>
           <w:rtl/>
         </w:rPr>
-        <w:t xml:space="preserve">"בפעם השלישית כבר התרגלתי": התרגלות, חזרתיות והתמדה</w:t>
+        <w:t xml:space="preserve">4.3 "בפעם השלישית כבר התרגלתי": התרגלות, חזרתיות והתמדה</w:t>
       </w:r>
     </w:p>
     <w:p>
@@ -1344,7 +1380,7 @@
           <w:szCs w:val="24"/>
           <w:rtl/>
         </w:rPr>
-        <w:t xml:space="preserve">ההתרגלות לא התקבלה כפתרון מוחלט, והילדים סייגו אותה. סאמר התעקש שהיא אינה מיידית: "אני לא מסכים איתה, כי מה שהיא אמרה לא נכון. מהפעם הראשונה לא מתרגלים. בטוח רק אחרי הרבה פעמים", וילד אחר העריך: "אחרי עשר פעמים בערך מתרגלים". במפגש הראשון העלו הילדים השערות על גבולות ההתרגלות: האם חתול שהתרגל לקופסה אחת יפחד מקופסה חדשה? סאמר סבר: "אם הוא פחד מהקופסה הראשונה, בטוח יפחד גם מהקופסה השנייה, כי זה אותו דבר", ואחרים חלקו: "אולי הקופסה השנייה תהיה קלה יותר, והוא יצליח לפתוח אותה ולא יפחד". הועלה גם סייג נוסף: "ואם השנייה חשוכה יותר מהראשונה? אז יפחד", וילדה אחת הבחינה בין דומה לשונה: "אם נשים אותו בקופסה שאינה דומה לראשונה, הוא יפחד ממנה מחדש". הילדים לא החזיקו אפוא בתפיסת התרגלות פשטנית אלא שרטטו לה תנאים: היא דורשת זמן וחזרות, היא תלוית-דמיון בין המקרים, והיא עשויה להישבר כשמופיע לא-נודע חדש.</w:t>
+        <w:t xml:space="preserve">ההתרגלות לא התקבלה כפתרון מוחלט, והילדים סייגו אותה. סאמר התעקש שהיא אינה מיידית: "אני לא מסכים איתה, כי מה שהיא אמרה לא נכון. מהפעם הראשונה לא מתרגלים. בטוח רק אחרי הרבה פעמים". בשלב זה נפתח משא ומתן של ממש על מספר הפעמים הדרוש: ילד אחד מנה בקצב עולה, "פעם ראשונה פחדת, פעם שנייה פחדת, פעם שלישית פחדת, מאה פעמים פחדת", וילד אחר קטע אותו והעריך: "אחרי עשר פעמים בערך אתה מתרגל". איש לא ידע לנקוב במספר מדויק, אבל כולם הסכימו שיש סף כלשהו שמעבר לו הפחד נשחק. במפגש הראשון העלו הילדים השערות על גבולות ההתרגלות: האם חתול שהתרגל לקופסה אחת יפחד מקופסה חדשה? סאמר סבר: "אם הוא פחד מהקופסה הראשונה, בטוח יפחד גם מהקופסה השנייה, כי זה אותו דבר", ואחרים חלקו: "אולי הקופסה השנייה תהיה קלה יותר, והוא יצליח לפתוח אותה ולא יפחד". הועלה גם סייג נוסף: "ואם השנייה חשוכה יותר מהראשונה? אז יפחד", וילדה אחת הבחינה בין דומה לשונה: "אם נשים אותו בקופסה שאינה דומה לראשונה, הוא יפחד ממנה מחדש". הילדים לא החזיקו אפוא בתפיסת התרגלות פשטנית אלא שרטטו לה תנאים: היא דורשת זמן וחזרות, היא תלוית-דמיון בין המקרים, והיא עשויה להישבר כשמופיע לא-נודע חדש.</w:t>
       </w:r>
     </w:p>
     <w:p>
@@ -1364,7 +1400,7 @@
           <w:szCs w:val="28"/>
           <w:rtl/>
         </w:rPr>
-        <w:t xml:space="preserve">"גם אחותי פוחדת מהחושך": קישור הסיפורים לחוויות אישיות</w:t>
+        <w:t xml:space="preserve">4.4 "גם אחותי פוחדת מהחושך": קישור הסיפורים לחוויות אישיות</w:t>
       </w:r>
     </w:p>
     <w:p>
@@ -1419,7 +1455,7 @@
           <w:szCs w:val="24"/>
           <w:rtl/>
         </w:rPr>
-        <w:t xml:space="preserve">בסיפור קצר זה שחזרה רימא את המהלך של לילא, פחד ראשוני, עצירה, שיקול והחלטה שאינה נכנעת לפחד, והפעילה אותו הלכה למעשה על חייה שלה. ילדים נוספים סיפרו על הפסקות חשמל בביתם, על לילה שבו נשארו לבדם, ועל חלום שבו כל הבית כבה והם לבדם באמצע הלילה. לצד סיפורי הפחד עלתה גם חוויה הפוכה: ילדים תיארו ערב של הפסקת חשמל שהפך דווקא לחגיגה, "הכנו פופקורן וראינו סרט", ובכך הראו, בלי לנסח זאת במפורש, שאותו חושך עצמו יכול להיות מפחיד או משמח, בהתאם לנסיבות ולחברה שסביבך. ההעברה הזו מן הסיפור אל החיים ובחזרה מעידה שהסיפורים לא נותרו עבור הילדים טקסט חיצוני, אלא הפכו כלי לחשיבה על עצמם.</w:t>
+        <w:t xml:space="preserve">בסיפור קצר זה שחזרה רימא את המהלך של לילא, פחד ראשוני, עצירה, שיקול והחלטה שאינה נכנעת לפחד, והפעילה אותו הלכה למעשה על חייה שלה. ילדים נוספים סיפרו על הפסקות חשמל בביתם, על לילה שבו נשארו לבדם, על חלום שבו כל הבית כבה והם לבדם באמצע הלילה, ואף על מעשי קונדס בין אחים: ילד אחד סיפר בצחוק כיצד כיבה בלילה את האור על אחותו, היודעת לפחד מהחושך, והבהיל אותה. גם הסיפור המשועשע הזה שירת את הדיון, שכן הוא המחיש את מה שהילדים ניסו לומר: מי שהחושך עדיין "לא נכנס לו לשכל" נבהל ממנו, ומי שמכיר אותו יכול אפילו לשחק בו. לצד סיפורי הפחד עלתה גם חוויה הפוכה: ילדים תיארו ערב של הפסקת חשמל שהפך דווקא לחגיגה, "הכנו פופקורן וראינו סרט", ובכך הראו, בלי לנסח זאת במפורש, שאותו חושך עצמו יכול להיות מפחיד או משמח, בהתאם לנסיבות ולחברה שסביבך. ההעברה הזו מן הסיפור אל החיים ובחזרה מעידה שהסיפורים לא נותרו עבור הילדים טקסט חיצוני, אלא הפכו כלי לחשיבה על עצמם.</w:t>
       </w:r>
     </w:p>
     <w:p>
@@ -1439,7 +1475,7 @@
           <w:szCs w:val="28"/>
           <w:rtl/>
         </w:rPr>
-        <w:t xml:space="preserve">"אני לא מסכים, כי...": מאפייני השיח הפילוסופי של הילדים</w:t>
+        <w:t xml:space="preserve">4.5 "אני לא מסכים, כי...": מאפייני השיח הפילוסופי של הילדים</w:t>
       </w:r>
     </w:p>
     <w:p>
@@ -1493,7 +1529,7 @@
           <w:szCs w:val="24"/>
           <w:rtl/>
         </w:rPr>
-        <w:t xml:space="preserve">שלישית, הילדים הפעילו חשיבה היפותטית ובחנו מקרים מדומיינים כדי לבדוק את טענותיהם: "ואם הקופסה תהיה מברזל או מעץ, מה אז?", "ואם החדר גדול והקופסה קטנה?", "ואם הקופסה השנייה תהיה חשוכה יותר מהראשונה?". שאלות "ואם" אלה שימשו את הילדים בדיוק כפי שניסויי מחשבה משמשים פילוסופים: לבחינת גבולותיו של עיקרון.</w:t>
+        <w:t xml:space="preserve">שלישית, הילדים הפעילו חשיבה היפותטית ובחנו מקרים מדומיינים כדי לבדוק את טענותיהם: "ואם הקופסה תהיה מברזל או מעץ, מה אז?", "ואם החדר גדול והקופסה קטנה?", "ואם הקופסה השנייה תהיה חשוכה יותר מהראשונה?". ההשערות גררו השערות נגד: על ההצעה שהחתול לא יצליח לצאת מקופסת עץ השיב מאג'ד, "בטוח הוא יצליח לפתוח אותה עם הטפרים שלו", וילד אחר דימה: "הוא יעשה מהראש שלו כמו סכין ויפתח אותה". אחד הילדים אף גייס דוגמה מן התרבות, תיבת האוצר של שודדי הים, כדי לברר ממה עשויה קופסה חזקה. שאלות "ואם" אלה שימשו את הילדים בדיוק כפי שניסויי מחשבה משמשים פילוסופים: לבחינת גבולותיו של עיקרון.</w:t>
       </w:r>
     </w:p>
     <w:p>
@@ -1512,6 +1548,24 @@
           <w:rtl/>
         </w:rPr>
         <w:t xml:space="preserve">לבסוף, הדיון גלש פעמים אחדות משאלת הפחד אל שאלות פילוסופיות רחבות עוד יותר, ובראשן שאלת נפשם של בעלי החיים. במפגש הראשון טען ילד אחד: "לחיה יש שכל אחר משל בן האדם. היא חושבת יותר. קופסה ראשונה, חשבה וחשבה; קופסה שנייה, חשבה; בשלישית כבר התרגלה", ואף הרחיק לכת: "החיות חכמות יותר מבני אדם. אם תהיה ביער, איך תגן על החיים שלך?". במפגש השלישי מתחו הילדים את גבול הפחד על פני עולם החי והדומם: "גם אנחנו בני האדם פוחדים וגם החיות פוחדות. האריה, הנמר, כל החיות", ועל השאלה המתגרה "אולי גם העץ פוחד?" השיב אחד הילדים: "לא, העץ הוא דומם". דיונים אלה, שנולדו מסיפורים על חתול ועכבר, מלמדים שהילדים עסקו בלא מודע בשאלות קלאסיות של פילוסופיית הנפש: למי יש תודעה, מי מסוגל לפחד, ומה מבדיל את החי מן הדומם.</w:t>
+      </w:r>
+    </w:p>
+    <w:p>
+      <w:pPr>
+        <w:bidi/>
+        <w:spacing w:after="120" w:line="360" w:lineRule="auto"/>
+        <w:jc w:val="both"/>
+      </w:pPr>
+      <w:r>
+        <w:rPr>
+          <w:rFonts w:ascii="David" w:cs="David" w:eastAsia="David" w:hAnsi="David"/>
+          <w:b w:val="false"/>
+          <w:i w:val="false"/>
+          <w:sz w:val="24"/>
+          <w:szCs w:val="24"/>
+          <w:rtl/>
+        </w:rPr>
+        <w:t xml:space="preserve">רגעי פליאה כאלה נקשרו גם לצל עצמו. במפגש השני עצרו הילדים לתהות איך בעצם הצל מלווה אותנו: "איך הוא הולך איתך?", שאל אחד, וחברו השיב, "הוא לא רודף אחריך. הוא חי איתך, הולך איתך", וילד אחר קרא בקריאת הפליאה הערבית "סובחאן אללה". התהייה על טבעו של הצל, דבר שאינו חפץ ואינו יצור ובכל זאת נצמד אלינו תמיד, היא בדיוק סוג הפליאה שממנו מתחילה חקירה פילוסופית, והיא עלתה אצל הילדים מאליה, בלי שאיש כיוון אותם אליה.</w:t>
       </w:r>
     </w:p>
     <w:p>
@@ -1536,32 +1590,199 @@
           <w:szCs w:val="32"/>
           <w:rtl/>
         </w:rPr>
-        <w:t xml:space="preserve">פרק הדיון</w:t>
-      </w:r>
-    </w:p>
-    <w:p>
-      <w:pPr>
-        <w:bidi/>
-        <w:spacing w:after="120" w:line="360" w:lineRule="auto"/>
-        <w:jc w:val="both"/>
-      </w:pPr>
-      <w:r>
-        <w:rPr>
-          <w:rFonts w:ascii="David" w:cs="David" w:eastAsia="David" w:hAnsi="David"/>
-          <w:b w:val="false"/>
-          <w:i w:val="false"/>
-          <w:sz w:val="24"/>
-          <w:szCs w:val="24"/>
-          <w:rtl/>
-        </w:rPr>
-        <w:t xml:space="preserve">פרק זה דן בממצאי המחקר בשני חלקים. בחלק הראשון ינותחו הממצאים לאור סקירת הספרות, על פי שלושה ראשי פרקים: הפחד כמושא לחקירה פילוסופית בגיל הרך; קהילת החקר כמרחב של הנמקה, אי-הסכמה ואכפתיות; והסיפור כגשר בין מושג לחיים. בחלק השני תוצע פרשנות לממצאים, תוך מתן מענה לשלוש שאלות המחקר.</w:t>
-      </w:r>
-    </w:p>
-    <w:p>
-      <w:pPr>
-        <w:pStyle w:val="Heading2"/>
-        <w:bidi/>
-        <w:spacing w:after="180" w:before="280" w:line="360" w:lineRule="auto"/>
+        <w:t xml:space="preserve">5. פרק הדיון</w:t>
+      </w:r>
+    </w:p>
+    <w:p>
+      <w:pPr>
+        <w:bidi/>
+        <w:spacing w:after="120" w:line="360" w:lineRule="auto"/>
+        <w:jc w:val="both"/>
+      </w:pPr>
+      <w:r>
+        <w:rPr>
+          <w:rFonts w:ascii="David" w:cs="David" w:eastAsia="David" w:hAnsi="David"/>
+          <w:b w:val="false"/>
+          <w:i w:val="false"/>
+          <w:sz w:val="24"/>
+          <w:szCs w:val="24"/>
+          <w:rtl/>
+        </w:rPr>
+        <w:t xml:space="preserve">פרק זה דן בממצאי המחקר באופן רציף ואינטגרטיבי: הוא שוזר את ניתוח הממצאים לאור סקירת הספרות יחד עם פרשנותי להם, ומשיב תוך כדי כך על שלוש שאלות המחקר, מקורות הפחד בעיני הילדים, דרכי ההתמודדות שהם מציעים, ומאפייני קהילת החקר שהתגלו בשיח שלהם.</w:t>
+      </w:r>
+    </w:p>
+    <w:p>
+      <w:pPr>
+        <w:bidi/>
+        <w:spacing w:after="120" w:line="360" w:lineRule="auto"/>
+        <w:jc w:val="both"/>
+      </w:pPr>
+      <w:r>
+        <w:rPr>
+          <w:rFonts w:ascii="David" w:cs="David" w:eastAsia="David" w:hAnsi="David"/>
+          <w:b w:val="false"/>
+          <w:i w:val="false"/>
+          <w:sz w:val="24"/>
+          <w:szCs w:val="24"/>
+          <w:rtl/>
+        </w:rPr>
+        <w:t xml:space="preserve">נקודת המוצא של הדיון היא הממצא הבולט ביותר במחקר: עצם קיומה של חקירה מושגית שיטתית של הפחד בפי ילדים בני חמש עד שבע. הילדים לא הסתפקו בזיהוי רגש ("החתול פחד") אלא שאלו על טיבו של הפחד עצמו: האם הוא תלוי בגודלו של הדבר המפחיד, מה יחסו לידיעה, והאם בסוף תהליך ההתרגלות הוא עדיין ראוי לשמו. שאלות אלה הן בדיוק מהסוג שמור-לון רואה בו ראשית רגישות פילוסופית: התעניינות בשאלות לא פתורות המלוות את הקיום, המעלה את המודעות לכך שהאופן שבו אנו תופסים את הדברים אינו בהכרח האופן שבו הם אכן הינם (Mohr Lone, 2012; קיזל, 2016). מתוך חקירה זו עולה תשובה עקבית ומפתיעה בבהירותה לשאלת המחקר הראשונה, בדבר מקורות הפחד: מקור הפחד, בעיני הילדים, אינו העצם אלא אי-הידיעה. הקופסה מפחידה כשהיא סגורה, הצל כשאין יודעים מהו, החושך כשהוא מסתיר את המוכר, ותנאים של גודל, ריקנות ובדידות מעצימים את הפחד, משום שהם מרחיבים את שטח הלא-נודע. אל החלל הזה, כפי שעלה בקטגוריה הראשונה, שולח הדמיון מפלצות. פרשנותי היא שהילדים מחזיקים למעשה בתפיסה אפיסטמית של פחד: הם מבינים אותו כפער בין מה שיש ובין מה שידוע. תובנתה של רימא, "החדר נשאר כמו שהוא, רק האור נעלם", היא ניסוח ילדי מדויק של הבחנה פילוסופית ותיקה בין המציאות ובין הנראוּת שלה, וכשילד אומר על דבר מוכר שהוא "נכנס לך לשכל", הוא מתאר את הרגע שבו הפער הזה נסגר.</w:t>
+      </w:r>
+    </w:p>
+    <w:p>
+      <w:pPr>
+        <w:bidi/>
+        <w:spacing w:after="120" w:line="360" w:lineRule="auto"/>
+        <w:jc w:val="both"/>
+      </w:pPr>
+      <w:r>
+        <w:rPr>
+          <w:rFonts w:ascii="David" w:cs="David" w:eastAsia="David" w:hAnsi="David"/>
+          <w:b w:val="false"/>
+          <w:i w:val="false"/>
+          <w:sz w:val="24"/>
+          <w:szCs w:val="24"/>
+          <w:rtl/>
+        </w:rPr>
+        <w:t xml:space="preserve">תשובה זו מובילה ישירות אל שאלת המחקר השנייה, שעניינה דרכי ההתמודדות עם הפחד, שכן לתפיסה אפיסטמית של פחד מתאימות תרופות אפיסטמיות. הילדים הציעו שתיים כאלה, המשלימות זו את זו. הראשונה היא הגילוי, הפועל בבת אחת: ברגע שנודע כי בקופסה כדור וכי הצל "הוא אני", הפחד בטל. השנייה היא ההתרגלות, הפועלת בהדרגה: מפגש חוזר עם דבר שאינו מזיק שוחק את הפחד "אחרי הרבה פעמים", ואולי, כפי שהעריך אחד הילדים במשא ומתן שנערך על כך, אחרי עשר. הילדים אף שכללו את התפיסה בשני כיוונים מנוגדים. מצד אחד הם סייגו אותה: ההתרגלות אינה מיידית, היא תלויה בדמיון בין המקרים, קופסה חדשה או חשוכה יותר עשויה להפחיד מחדש, ויש מי שממשיך לפחד מהחושך גם כשהוא יודע היטב שדבר לא השתנה בחדר. מצד אחר הם הכלילו אותה הרחק מעבר לפחד, אל עקרון חיים של התמדה ואימון, שמאג'ד ניסח כ"ההתמדה היא הבסיס להצלחה". בין הסיוג להכללה ביצעו הילדים עבודה מושגית של ממש על ההבחנה בין רגש ובין עמדה כלפי רגש: תובנתם העמוקה ביותר, "זה כבר לא נקרא פחד, זה נהיה 'לא אכפת לי'", מלמדת שהם מבינים כי הרגש אינו גזירת גורל אלא דבר-מה שאפשר לחשוב עליו, לפעול בו ולשנותו, עד כדי החלפת שמו.</w:t>
+      </w:r>
+    </w:p>
+    <w:p>
+      <w:pPr>
+        <w:bidi/>
+        <w:spacing w:after="120" w:line="360" w:lineRule="auto"/>
+        <w:jc w:val="both"/>
+      </w:pPr>
+      <w:r>
+        <w:rPr>
+          <w:rFonts w:ascii="David" w:cs="David" w:eastAsia="David" w:hAnsi="David"/>
+          <w:b w:val="false"/>
+          <w:i w:val="false"/>
+          <w:sz w:val="24"/>
+          <w:szCs w:val="24"/>
+          <w:rtl/>
+        </w:rPr>
+        <w:t xml:space="preserve">מהלך זה של בחינת רגש והערכתו מחדש הוא בדיוק מה ששארפ תיארה כחינוך הרגשות בקהילת החקר. אם רגש כרוך בשיפוט, והפחד כרוך בשיפוט שדבר-מה מסוכן, הרי שהילדים העמידו את השיפוט הזה למבחן הראיות ("הוא רואה אותו כל יום והוא לא מזיק לו") ותיקנו אותו לאורן, ובכך צמחו לא רק בחשיבתם אלא גם בבגרותם הרגשית (Sharp, 2007). ממצא זה מתיישב עם העדויות האמפיריות העדכניות שלפיהן דיאלוג פילוסופי שיטתי על רגשות משפר את הבנת הרגשות ואת הכשירות החברתית-רגשית של ילדי גן (Arda Tuncdemir et al., 2022). חשוב להנגיד את המהלך הזה לתגובה המבוגרת השגרתית לפחדי ילדים, "אין ממה לפחד": תגובה שסוגרת את החשיבה במקום לפתוח אותה, ומגלמת בזעיר אנפין את מה שקיזל מכנה פדגוגיה של פחד, זו המבקשת להגן על הילד מפני שאלותיו שלו במקום לתת להן מקום (Kizel, 2015, 2016c). הילדים במחקר זה קיבלו את המקום הזה, והשתמשו בו.</w:t>
+      </w:r>
+    </w:p>
+    <w:p>
+      <w:pPr>
+        <w:bidi/>
+        <w:spacing w:after="120" w:line="360" w:lineRule="auto"/>
+        <w:jc w:val="both"/>
+      </w:pPr>
+      <w:r>
+        <w:rPr>
+          <w:rFonts w:ascii="David" w:cs="David" w:eastAsia="David" w:hAnsi="David"/>
+          <w:b w:val="false"/>
+          <w:i w:val="false"/>
+          <w:sz w:val="24"/>
+          <w:szCs w:val="24"/>
+          <w:rtl/>
+        </w:rPr>
+        <w:t xml:space="preserve">הישגיהם המושגיים של הילדים מקבלים משנה תוקף על רקע גילם. על פי הקריאה המקובלת של פיאז'ה (1986), ילדים בני חמש עד שבע מצויים בשלב הקדם-אופרציונלי, שבו חשיבה מופשטת והיפותטית אמורה להיות מעבר להישג ידם. ואולם הילדים במחקר זה הפעילו חשיבה היפותטית מפורשת ("ואם הקופסה מברזל?", "ואם החדר גדול והקופסה קטנה?"), השיבו על השערות בהשערות נגד ("בטוח יצליח לפתוח אותה עם הטפרים שלו"), ניסחו הכללות מסויגות והגדירו מחדש מושג. ממצא זה מצטרף לטענת מאתיוס שילדים צעירים מאוד, אף בני שלוש, מסוגלים לחשיבה לוגית של ממש (Matthews, 1994; Kizel, 2016d), ולממצאי המחקר בבית הספר במזרח ירושלים, שבו הופתעו המורות מיכולת ההפשטה של תלמידות צעירות בניגוד להנחותיהן ההתפתחותיות (Kizel &amp; Abdallah, 2017). חשוב לדייק: אין בכך הפרכה של פיאז'ה על יסוד חמישה ילדים, אלא המחשה לטענתם של קיזל ושל מאתיוס כי הקריאה החינוכית הנוקשה של תיאוריית השלבים מחמיצה את מה שילדים מסוגלים לו בפועל, וכי היא משמשת בסיס לאותה שלילת לגיטימציה של השאלה הפילוסופית בגיל צעיר (קיזל, 2016; Kizel, 2016c). זאת ועוד, התובנות המורכבות ביותר במפגשים לא נאמרו על ידי ילד יחיד בבידוד אלא נבנו בהדרגה בשיח, כשילד מציע, חברו מסייג ושלישי מדגים. תצפית זו מתיישבת עם המסורת הוויגוצקיאנית שעליה נשען ליפמן, הרואה בחשיבה תוצר של אינטראקציה חברתית ובדיאלוג מנוע של התפתחות (Vygotsky, 1993; Kizel, 2016b): הקבוצה חשבה יחד מה שאיש מחבריה לא היה מנסח לבדו.</w:t>
+      </w:r>
+    </w:p>
+    <w:p>
+      <w:pPr>
+        <w:bidi/>
+        <w:spacing w:after="120" w:line="360" w:lineRule="auto"/>
+        <w:jc w:val="both"/>
+      </w:pPr>
+      <w:r>
+        <w:rPr>
+          <w:rFonts w:ascii="David" w:cs="David" w:eastAsia="David" w:hAnsi="David"/>
+          <w:b w:val="false"/>
+          <w:i w:val="false"/>
+          <w:sz w:val="24"/>
+          <w:szCs w:val="24"/>
+          <w:rtl/>
+        </w:rPr>
+        <w:t xml:space="preserve">עדות נוספת לעומקה של החקירה טמונה בגלישותיה. הדיון בפחד לא נשאר בגבולות השאלה שנבחרה, אלא נפתח מעצמו אל שאלות מטפיזיות רחבות: האם לחיה יש שכל, והאם היא חושבת יותר מבן אדם או פחות ממנו; מי בכלל מסוגל לפחד, והיכן עובר הגבול בין החי ובין הדומם ("העץ לא פוחד, הוא דומם"); ומה טיבו של צל, שאינו חפץ ואינו יצור ובכל זאת "חי איתך, הולך איתך". גלישות אלה אינן סטייה מהנושא אלא לב העניין: הן ממחישות את טענת קיזל שהשאלה הפילוסופית של ילדים חולשת על כל תחומי החיים בלי גבולות משורטטים (קיזל, 2016), את הרעננות הפילוסופית ואת ההמצאתיות שמאתיוס זיהה בשאלות ילדים (Matthews, 1994; מאתיוס, 2003), ואת זיקתה של הרגישות הפילוסופית לאינטליגנציה הקיומית שהגדיר גארדנר, הנטייה להעלות שאלות על החיים ועל המציאות ולהרהר בהן (קיזל, 2016; Kizel, 2015). הפחד, המוכר לכל ילד מבשרו, התגלה כשער נגיש במיוחד אל השאלות הללו, כשם שהמוות שימש שער כזה בקהילות החקר שתיעד קיזל סביב אתרי הנצחה, שבהן הגיעו ילדים מעיסוק באובדן אל שאלות על עצם הקיום (Kizel, 2014). בשני המקרים המסקנה דומה: נושא רגשי "כבד" אינו מרתיע את הילדים אלא מזמין אותם, ובלבד שניתן להם מרחב בטוח לחקור אותו.</w:t>
+      </w:r>
+    </w:p>
+    <w:p>
+      <w:pPr>
+        <w:bidi/>
+        <w:spacing w:after="120" w:line="360" w:lineRule="auto"/>
+        <w:jc w:val="both"/>
+      </w:pPr>
+      <w:r>
+        <w:rPr>
+          <w:rFonts w:ascii="David" w:cs="David" w:eastAsia="David" w:hAnsi="David"/>
+          <w:b w:val="false"/>
+          <w:i w:val="false"/>
+          <w:sz w:val="24"/>
+          <w:szCs w:val="24"/>
+          <w:rtl/>
+        </w:rPr>
+        <w:t xml:space="preserve">בכך אנו מגיעים לשאלת המחקר השלישית, שעניינה מאפייני קהילת החקר בשיח הילדים. בתוך שלושה מפגשים קצרים הופיעו כל ארבעת המאפיינים שמנה ליפמן: הקשבה הדדית, בנייה על רעיונות של אחרים, אתגור מנומק וחשיפת הנחות (Lipman, 1991). דרישת ההנמקה, שהובנתה במפגשים באמצעות השאלה החוזרת "מדוע?", הופנמה עד מהרה על ידי הילדים עצמם: הם החלו לנמק בלי שנשאלו, ואף ניסחו קריטריונים לטיעון טוב, כדברי לינא על דברי חברה שהם "נכונים ומשכנעים" וגם "קשורים לסיפור", כלומר תקפים ורלוונטיים. יכולתו של ילד להודות "אני מסכים איתו כי הוא שכנע אותי", להעיד בפה מלא על שינוי עמדה בעקבות טיעון, היא ביטוי מובהק לנכונות להיענות לכוחו של הנימוק הטוב, שליפמן ושותפיו ראו בה אבן יסוד של חשיבה מיומנת (Lipman et al., 1980). לא פחות חשובה ממנה הלגיטימיות של אי-ההסכמה: רימא, שעמדה מול ביקורת והשיבה "אולי הוא לא הבין את הסיפור כמו שאני הבנתי אותו", ביטאה בו-זמנית עמידה על דעתה והכרה בכך שפרשנויות שונות של אותו טקסט אפשריות, הבחנה בין טקסט לפרשנותו שרבים ממבוגרינו מתקשים בה. כל זה התרחש באווירה אכפתית: הביקורת הופנתה כלפי תוכן הדברים ולא כלפי הדובר, הילדים המשיכו לשתף פעולה מיד לאחר חילוקי הדעות, וההומור, כמו בצחוק המשותף על העכבר ש"פחד מעצמו", שימש דבק חברתי ולא כלי לעג. זהו מימוש של קהילה שבה חילוקי דעות אינם עימות אלא חלק מעושר משותף (Sharp, 1988; קיזל, 2016), ואיכות הקשב ההדדי בה קרובה למה שקיזל, בעקבות בובר, מתאר כזיקת "אני-אתה": מפגש בין שווים המאופיין בהדדיות ובנוכחות, שבו האחר הוא שותף לחקירה ולא אמצעי לניצחון בוויכוח (Kizel, 2017a). רגעי הפליאה שתועדו בממצאים, ההתפעלות מהצל ש"חי איתך, הולך איתך", מזכירים שהחקירה לא הייתה תרגיל בהנמקה בלבד אלא גם התנסות בפליאה, אותו יסוד שהספרות רואה בו את ראשית הפילוסופיה כולה (קיזל, 2016).</w:t>
+      </w:r>
+    </w:p>
+    <w:p>
+      <w:pPr>
+        <w:bidi/>
+        <w:spacing w:after="120" w:line="360" w:lineRule="auto"/>
+        <w:jc w:val="both"/>
+      </w:pPr>
+      <w:r>
+        <w:rPr>
+          <w:rFonts w:ascii="David" w:cs="David" w:eastAsia="David" w:hAnsi="David"/>
+          <w:b w:val="false"/>
+          <w:i w:val="false"/>
+          <w:sz w:val="24"/>
+          <w:szCs w:val="24"/>
+          <w:rtl/>
+        </w:rPr>
+        <w:t xml:space="preserve">להתרחשות הזאת תרמו, להערכתי, שלושה תנאים מאפשרים השזורים זה בזה. הראשון הוא עמדת ההנחיה המצומצמת. שאלות ההנחיה נותרו פרוצדורליות ("מי מסכים? מדוע?") ולא תוכניות, ברוח התביעה מהמנחה לסגת ולא להטיל צל ידעני על הדיון (קיזל, 2016), ברוח המודל הרואה ברכז משתתף ולא שופט (Kizel, 2016d), וברוח הדרישה מהמנחה לשחרר תחילה את עצמו מהנחותיו (Kizel, 2021). התוצאה הייתה שהתובנות המרכזיות של המפגשים, "רק האור נעלם", "ההתמדה היא הבסיס להצלחה", ההבחנה בין פחד ל"לא אכפת לי", נוסחו כולן על ידי הילדים. יש להודות שלנסיגה הזאת היה גם מחיר: היו רגעים שבהם שאלת "מי מסכים?" חזרה בלי שהעמיקה את הדיון, ושאלת המשך פילוסופית אחת, למשל "מה ההבדל בין להתרגל ובין להפסיק לפחד?", הייתה עשויה להעלות את החקירה מדרגה. התנאי השני הוא השפה: קיומם של המפגשים בערבית, שפת אימם של הילדים, אפשר להם לשאול ולהשיב מתוך עולמם התרבותי, ברוח הקריאה להנכיח את קולם האותנטי של ילדים מקבוצות מיעוט לשוני בקהילות חקר (Kizel, 2016a) וברוח הממצאים על כוחה של פילוסופיה עם ילדים בחברה הערבית (Kizel &amp; Abdallah, 2017). הילדים גייסו לדיון את חצר ביתם, את אחיהם ואחיותיהם, את הפסקות החשמל בשכונתם ואפילו מושג ערבי, "תטניש", ששימש אותם להגדרה מחודשת של רגש: עולם חיים שלם שנכנס אל החקירה בלי תיווך ובלי תרגום. התנאי השלישי הוא הנושא עצמו: הפחד, רגש אוניברסלי שכל ילד מכיר מבשרו, נדון כאן דרך דמויות בדויות, חתול, עכבר וילדה, ולכן זימן לכל ילד גם ידע אישי ("גם אני פחדתי") וגם מרחק מגונן (הפוחד הוא החתול). המרחק הזה הוא שאפשר לגעת בתוכן רגשי באופן נסבל ומעשיר, כפי שמצא קיזל בקהילות חקר שעסקו בעוני ואף במוות (Kizel, 2014, 2015).</w:t>
+      </w:r>
+    </w:p>
+    <w:p>
+      <w:pPr>
+        <w:bidi/>
+        <w:spacing w:after="120" w:line="360" w:lineRule="auto"/>
+        <w:jc w:val="both"/>
+      </w:pPr>
+      <w:r>
+        <w:rPr>
+          <w:rFonts w:ascii="David" w:cs="David" w:eastAsia="David" w:hAnsi="David"/>
+          <w:b w:val="false"/>
+          <w:i w:val="false"/>
+          <w:sz w:val="24"/>
+          <w:szCs w:val="24"/>
+          <w:rtl/>
+        </w:rPr>
+        <w:t xml:space="preserve">התנועה הדו-כיוונית שנמצאה בקטגוריה הרביעית, מהסיפור אל החיים ("גם אחותי פוחדת מהחושך") ומהחיים אל הסיפור ("אותו דבר העכבר"), ממחישה את עקרון הרלוונטיות של ליפמן: אם דבר אינו קשור לחייו של אדם, אין לו למעשה משמעות עבורו (Kizel, 2017b). הסיפורים לא נותרו טקסט חיצוני אלא הפכו כלי חשיבה, והתובנות שנוצרו סביבם חזרו אל החיים ככלי פעולה. סיפורה של רימא על הפסקת החשמל, שבו שחזרה צעד אחר צעד את מהלכה של לילא והכריעה שלא להיכנע לפחד, הוא הדגמה חיה של מה שקיזל מכנה יצירת משמעות כפעולה, ושל המהלך מן המעבדה הפילוסופית אל הפרקסיס (Kizel, 2016b, 2017b): מה שנוסח במעגל הקטן יושם במטבח חשוך, בזמן אמת. אפשר לראות בכך גם גרעין של אחריות במובן שפראנקל העניק למושג, כפי שמביא קיזל: המשמעות מתגלה ואינה מומצאת, ומציאתה כרוכה בנטילת אחריות על מימוש הפוטנציאל הייחודי גם בגיל צעיר (Kizel, 2017b). הכלל שניסחו הילדים, "ההתמדה היא הבסיס להצלחה", אינו רק תובנה קוגניטיבית; הוא הצהרת אחריות: אם ההתמדה היא הבסיס להצלחה, הרי שההתגברות על הפחד תלויה בי, במספר הפעמים שאתאמן, בנכונותי לעצור ולבדוק במקום לברוח.</w:t>
+      </w:r>
+    </w:p>
+    <w:p>
+      <w:pPr>
+        <w:bidi/>
+        <w:spacing w:after="120" w:line="360" w:lineRule="auto"/>
+        <w:jc w:val="both"/>
+      </w:pPr>
+      <w:r>
+        <w:rPr>
+          <w:rFonts w:ascii="David" w:cs="David" w:eastAsia="David" w:hAnsi="David"/>
+          <w:b w:val="false"/>
+          <w:i w:val="false"/>
+          <w:sz w:val="24"/>
+          <w:szCs w:val="24"/>
+          <w:rtl/>
+        </w:rPr>
+        <w:t xml:space="preserve">סיכומו של דיון: שלוש התשובות לשאלות המחקר מצטרפות לתמונה אחת. ילדים בני חמש עד שבע תופסים את הפחד כפער של ידיעה, מציעים לו תרופות של גילוי ושל התרגלות שהם עצמם מסייגים ומכלילים, ועושים כל זאת בתוך שיח שיש בו הנמקה, אי-הסכמה לגיטימית, פליאה ואכפתיות, כלומר בתוך קהילת חקר פילוסופית של ממש, על כל מאפייניה. בכך מציעה העבודה חיזוק אמפירי צנוע, מקומי, אך חד במשמעותו, לטענה העומדת בלב כתיבתו של קיזל: הפחד המבוגר מפני עיסוק רגשי-קיומי עם ילדים, אותה פדגוגיה של פחד העושה לילדוּת פתולוגיזציה, אינו במקומו (Kizel, 2015, 2016c). הילדים במחקר זה לא נזקקו להגנה מפני השאלות על הפחד. הם נזקקו בדיוק להפך: למרחב בטוח, לסיפור קצר, לדף ולשאלה, וכל השאר, החקירה, ההנמקה, התובנות וההדרכה העצמית לחיים, בא מהם.</w:t>
+      </w:r>
+    </w:p>
+    <w:p>
+      <w:r>
+        <w:br w:type="page"/>
+      </w:r>
+    </w:p>
+    <w:p>
+      <w:pPr>
+        <w:pStyle w:val="Heading1"/>
+        <w:bidi/>
+        <w:spacing w:after="240" w:before="360" w:line="360" w:lineRule="auto"/>
         <w:jc w:val="right"/>
       </w:pPr>
       <w:r>
@@ -1570,440 +1791,119 @@
           <w:b/>
           <w:bCs/>
           <w:i w:val="false"/>
-          <w:sz w:val="28"/>
-          <w:szCs w:val="28"/>
-          <w:rtl/>
-        </w:rPr>
-        <w:t xml:space="preserve">ניתוח הממצאים</w:t>
-      </w:r>
-    </w:p>
-    <w:p>
-      <w:pPr>
-        <w:pStyle w:val="Heading3"/>
-        <w:bidi/>
-        <w:spacing w:after="140" w:before="220" w:line="360" w:lineRule="auto"/>
-        <w:jc w:val="right"/>
-      </w:pPr>
-      <w:r>
-        <w:rPr>
-          <w:rFonts w:ascii="David" w:cs="David" w:eastAsia="David" w:hAnsi="David"/>
-          <w:b/>
-          <w:bCs/>
-          <w:i w:val="false"/>
-          <w:sz w:val="26"/>
-          <w:szCs w:val="26"/>
-          <w:rtl/>
-        </w:rPr>
-        <w:t xml:space="preserve">הפחד כמושא לחקירה פילוסופית בגיל הרך</w:t>
-      </w:r>
-    </w:p>
-    <w:p>
-      <w:pPr>
-        <w:bidi/>
-        <w:spacing w:after="120" w:line="360" w:lineRule="auto"/>
-        <w:jc w:val="both"/>
-      </w:pPr>
-      <w:r>
-        <w:rPr>
-          <w:rFonts w:ascii="David" w:cs="David" w:eastAsia="David" w:hAnsi="David"/>
-          <w:b w:val="false"/>
-          <w:i w:val="false"/>
-          <w:sz w:val="24"/>
-          <w:szCs w:val="24"/>
-          <w:rtl/>
-        </w:rPr>
-        <w:t xml:space="preserve">הממצא הבולט ביותר במחקר הוא עצם קיומה של חקירה מושגית שיטתית של הפחד בפי ילדים בני חמש עד שבע. הילדים לא הסתפקו בזיהוי רגש ("החתול פחד") אלא שאלו על טיבו של הפחד עצמו: האם הוא תלוי בגודלו של הדבר המפחיד, מה יחסו לידיעה, והאם בסוף תהליך ההתרגלות הוא עדיין ראוי לשמו. שאלות אלה הן בדיוק מהסוג שמור-לון רואה בו ראשית רגישות פילוסופית: התעניינות בשאלות לא פתורות המלוות את הקיום, המעלה את המודעות לכך שהאופן שבו אנו תופסים את הדברים אינו בהכרח האופן שבו הם אכן הינם (Mohr Lone, 2012; קיזל, 2016). תובנתה של רימא, "החדר נשאר כמו שהוא, רק האור נעלם", היא ניסוח ילדי מדויק של הבחנה זו עצמה: הבחנה בין המציאות ובין הנראוּת שלה.</w:t>
-      </w:r>
-    </w:p>
-    <w:p>
-      <w:pPr>
-        <w:bidi/>
-        <w:spacing w:after="120" w:line="360" w:lineRule="auto"/>
-        <w:jc w:val="both"/>
-      </w:pPr>
-      <w:r>
-        <w:rPr>
-          <w:rFonts w:ascii="David" w:cs="David" w:eastAsia="David" w:hAnsi="David"/>
-          <w:b w:val="false"/>
-          <w:i w:val="false"/>
-          <w:sz w:val="24"/>
-          <w:szCs w:val="24"/>
-          <w:rtl/>
-        </w:rPr>
-        <w:t xml:space="preserve">ממצאים אלה מחזקים את הביקורת של מאתיוס ושל קיזל על התפיסה ההתפתחותית הנוקשה. על פי הקריאה המקובלת של פיאז'ה (1986), ילדים בגילאי חמש עד שבע מצויים בשלב הקדם-אופרציונלי, שבו חשיבה מופשטת והיפותטית אמורה להיות מעבר להישג ידם. הילדים במחקר זה הפעילו חשיבה היפותטית מפורשת ("ואם הקופסה מברזל?", "ואם החדר גדול והקופסה קטנה?"), ניסחו הכללות מסויגות ואף עסקו בהגדרה מחודשת של מושג. הדבר עולה בקנה אחד עם טענת מאתיוס שילדים צעירים מאוד, אף בני שלוש, מסוגלים לחשיבה לוגית של ממש (Matthews, 1994; Kizel, 2016d), ועם ממצאי המחקר בבית הספר במזרח ירושלים, שבו הופתעו המורות מיכולת ההפשטה של תלמידות צעירות בניגוד להנחותיהן ההתפתחותיות (Kizel &amp; Abdallah, 2017). הוא מתיישב גם עם המסורת הוויגוצקיאנית שעליה נשען ליפמן, הרואה בחשיבה תוצר של אינטראקציה חברתית: התובנות המורכבות ביותר במפגשים לא נאמרו על ידי ילד יחיד בבידוד אלא נבנו בהדרגה בשיח, כשילד מציע, חברו מסייג ושלישי מדגים (Vygotsky, 1993; Kizel, 2016b).</w:t>
-      </w:r>
-    </w:p>
-    <w:p>
-      <w:pPr>
-        <w:bidi/>
-        <w:spacing w:after="120" w:line="360" w:lineRule="auto"/>
-        <w:jc w:val="both"/>
-      </w:pPr>
-      <w:r>
-        <w:rPr>
-          <w:rFonts w:ascii="David" w:cs="David" w:eastAsia="David" w:hAnsi="David"/>
-          <w:b w:val="false"/>
-          <w:i w:val="false"/>
-          <w:sz w:val="24"/>
-          <w:szCs w:val="24"/>
-          <w:rtl/>
-        </w:rPr>
-        <w:t xml:space="preserve">הממצאים מתכתבים גם עם תפיסתה של שארפ בדבר חינוך הרגשות בקהילת החקר. אם רגש כרוך בשיפוט, והפחד כרוך בשיפוט שדבר-מה מסוכן, הרי שהילדים במחקר זה עשו בדיוק את מה ששארפ מתארת: הם בחנו את השיפוט שבבסיס הפחד, העמידו אותו למבחן הראיות ("הוא רואה אותו כל יום והוא לא מזיק לו") והעריכו אותו מחדש, עד כדי שלילת שמו של הרגש ("זה כבר לא נקרא פחד"). זהו חינוך רגשי המתרחש לא באמצעות הרגעה מבוגרת אלא באמצעות חקירה ילדית עצמית (Sharp, 2007), ברוח הממצאים האמפיריים על שיפור הבנת הרגשות אצל ילדי גן שהשתתפו בדיאלוג פילוסופי על רגשות (Arda Tuncdemir et al., 2022). מהלך זה שונה תכלית שינוי מהתגובה המבוגרת השגרתית לפחדי ילדים, "אין ממה לפחד", שאינה מזמינה חשיבה אלא סוגרת אותה.</w:t>
-      </w:r>
-    </w:p>
-    <w:p>
-      <w:pPr>
-        <w:bidi/>
-        <w:spacing w:after="120" w:line="360" w:lineRule="auto"/>
-        <w:jc w:val="both"/>
-      </w:pPr>
-      <w:r>
-        <w:rPr>
-          <w:rFonts w:ascii="David" w:cs="David" w:eastAsia="David" w:hAnsi="David"/>
-          <w:b w:val="false"/>
-          <w:i w:val="false"/>
-          <w:sz w:val="24"/>
-          <w:szCs w:val="24"/>
-          <w:rtl/>
-        </w:rPr>
-        <w:t xml:space="preserve">הדיון בפחד גלש מעצמו אל שאלות קיומיות ומטפיזיות רחבות עוד יותר, ובראשן שאלת נפשם של בעלי החיים ומה מבדיל את החי מן הדומם. גלישה זו ממחישה את טענת קיזל שהשאלה הפילוסופית של ילדים חולשת על כל תחומי החיים בלי גבולות משורטטים (קיזל, 2016), ואת זיקת הרגישות הפילוסופית לאינטליגנציה הקיומית של גארדנר (קיזל, 2016; Kizel, 2015). הפחד, המוכר לכל ילד מבשרו, התגלה כשער נגיש במיוחד אל שאלות אלה, כשם שהמוות שימש שער כזה בקהילות החקר שתיעד קיזל סביב אתרי הנצחה (Kizel, 2014).</w:t>
-      </w:r>
-    </w:p>
-    <w:p>
-      <w:pPr>
-        <w:pStyle w:val="Heading3"/>
-        <w:bidi/>
-        <w:spacing w:after="140" w:before="220" w:line="360" w:lineRule="auto"/>
-        <w:jc w:val="right"/>
-      </w:pPr>
-      <w:r>
-        <w:rPr>
-          <w:rFonts w:ascii="David" w:cs="David" w:eastAsia="David" w:hAnsi="David"/>
-          <w:b/>
-          <w:bCs/>
-          <w:i w:val="false"/>
-          <w:sz w:val="26"/>
-          <w:szCs w:val="26"/>
-          <w:rtl/>
-        </w:rPr>
-        <w:t xml:space="preserve">קהילת החקר כמרחב של הנמקה, אי-הסכמה ואכפתיות</w:t>
-      </w:r>
-    </w:p>
-    <w:p>
-      <w:pPr>
-        <w:bidi/>
-        <w:spacing w:after="120" w:line="360" w:lineRule="auto"/>
-        <w:jc w:val="both"/>
-      </w:pPr>
-      <w:r>
-        <w:rPr>
-          <w:rFonts w:ascii="David" w:cs="David" w:eastAsia="David" w:hAnsi="David"/>
-          <w:b w:val="false"/>
-          <w:i w:val="false"/>
-          <w:sz w:val="24"/>
-          <w:szCs w:val="24"/>
-          <w:rtl/>
-        </w:rPr>
-        <w:t xml:space="preserve">הממצאים בקטגוריה החמישית מלמדים כי בשלושת המפגשים התקיימו, בזעיר אנפין, מאפייני היסוד של קהילת החקר: הילדים הקשיבו זה לזה, בנו על רעיונות של אחרים, אתגרו זה את זה בדרישה לנימוקים וחשפו הנחות יסוד (Lipman, 1991). דרישת ההנמקה, שהובנתה במפגשים באמצעות השאלה החוזרת "מדוע?", הופנמה עד מהרה על ידי הילדים עצמם. הם החלו לנמק בלי שנשאלו ואף ניסחו קריטריונים לטיעון טוב, כדברי לינא: "מה שהוא אמר נכון ומשכנע, ומה שהוא אמר קשור לסיפור". יכולתו של ילד להודות "אני מסכים איתו כי הוא שכנע אותי", כלומר להעיד על שינוי עמדה בעקבות טיעון, היא ביטוי מובהק לנכונות להיענות לכוחו של הנימוק הטוב (Lipman et al., 1980). איכות הקשב ההדדי קרובה למה שקיזל, בעקבות בובר, מתאר כזיקת "אני-אתה": הילדים פנו זה אל זה כשווים, שותפים לחקירה ולא יריבים בתחרות על תשובה נכונה (Kizel, 2017a).</w:t>
-      </w:r>
-    </w:p>
-    <w:p>
-      <w:pPr>
-        <w:bidi/>
-        <w:spacing w:after="120" w:line="360" w:lineRule="auto"/>
-        <w:jc w:val="both"/>
-      </w:pPr>
-      <w:r>
-        <w:rPr>
-          <w:rFonts w:ascii="David" w:cs="David" w:eastAsia="David" w:hAnsi="David"/>
-          <w:b w:val="false"/>
-          <w:i w:val="false"/>
-          <w:sz w:val="24"/>
-          <w:szCs w:val="24"/>
-          <w:rtl/>
-        </w:rPr>
-        <w:t xml:space="preserve">חשובה לא פחות היא הלגיטימיות של אי-ההסכמה. רימא, שעמדה מול ביקורת והשיבה "אולי הוא לא הבין את הסיפור כמו שאני הבנתי אותו", ביטאה עמדה כפולה: עמידה על דעתה, ובה בעת הכרה בכך שפרשנויות שונות של אותו טקסט אפשריות. זהו מימוש של קהילה שבה חילוקי דעות אינם עימות אלא חלק מעושר משותף (Sharp, 1988; קיזל, 2016). האווירה נותרה אכפתית: הביקורת הופנתה כלפי תוכן הדברים ולא כלפי הדובר, והילדים המשיכו לשתף פעולה מיד לאחר חילוקי הדעות, ביטוי לחשיבה האכפתית שבלעדיה אין דיאלוג דמוקרטי (Sharp, 2007).</w:t>
-      </w:r>
-    </w:p>
-    <w:p>
-      <w:pPr>
-        <w:bidi/>
-        <w:spacing w:after="120" w:line="360" w:lineRule="auto"/>
-        <w:jc w:val="both"/>
-      </w:pPr>
-      <w:r>
-        <w:rPr>
-          <w:rFonts w:ascii="David" w:cs="David" w:eastAsia="David" w:hAnsi="David"/>
-          <w:b w:val="false"/>
-          <w:i w:val="false"/>
-          <w:sz w:val="24"/>
-          <w:szCs w:val="24"/>
-          <w:rtl/>
-        </w:rPr>
-        <w:t xml:space="preserve">הממצאים מדגימים גם את חשיבות עמדת המנחה המצומצמת. שאלות ההנחיה נותרו פרוצדורליות ("מי מסכים? מדוע?") ולא תוכניות, ברוח התביעה מהמנחה לסגת ולא להטיל צל ידעני על הדיון (קיזל, 2016), וברוח המודל הרואה ברכז משתתף ולא שופט (Kizel, 2016d) ובמנחה מי שנדרש תחילה לשחרר את עצמו מהנחותיו (Kizel, 2021). התוצאה הייתה שהתובנות המרכזיות של המפגשים, "רק האור נעלם", "ההתמדה היא הבסיס להצלחה", ההבחנה בין פחד ל"לא אכפת לי", נוסחו כולן על ידי הילדים ולא על ידי המבוגר. יש להודות שמיעוט ההתערבות הותיר גם רגעים של חזרתיות בשיח, שבהם שאלת "מי מסכים?" חזרה בלי שהעמיקה את הדיון; סוגיה זו תידון בסיכום. קיומם של המפגשים בשפת אימם של הילדים, ערבית, אפשר להם לשאול ולהשיב מתוך עולמם התרבותי, ברוח הקריאה להנכיח את קולם האותנטי של ילדים מקבוצות מיעוט לשוני בקהילות חקר (Kizel, 2016a) וברוח הממצאים על כוחה של פילוסופיה עם ילדים בחברה הערבית (Kizel &amp; Abdallah, 2017). הילדים גייסו לדיון את חצר ביתם, את אחיהם ואחיותיהם ואת הפסקות החשמל בשכונתם: עולם חיים שלם שנכנס אל החקירה בלי תיווך ובלי תרגום.</w:t>
-      </w:r>
-    </w:p>
-    <w:p>
-      <w:pPr>
-        <w:pStyle w:val="Heading3"/>
-        <w:bidi/>
-        <w:spacing w:after="140" w:before="220" w:line="360" w:lineRule="auto"/>
-        <w:jc w:val="right"/>
-      </w:pPr>
-      <w:r>
-        <w:rPr>
-          <w:rFonts w:ascii="David" w:cs="David" w:eastAsia="David" w:hAnsi="David"/>
-          <w:b/>
-          <w:bCs/>
-          <w:i w:val="false"/>
-          <w:sz w:val="26"/>
-          <w:szCs w:val="26"/>
-          <w:rtl/>
-        </w:rPr>
-        <w:t xml:space="preserve">הסיפור כגשר: ממשמעות הטקסט למשמעות החיים</w:t>
-      </w:r>
-    </w:p>
-    <w:p>
-      <w:pPr>
-        <w:bidi/>
-        <w:spacing w:after="120" w:line="360" w:lineRule="auto"/>
-        <w:jc w:val="both"/>
-      </w:pPr>
-      <w:r>
-        <w:rPr>
-          <w:rFonts w:ascii="David" w:cs="David" w:eastAsia="David" w:hAnsi="David"/>
-          <w:b w:val="false"/>
-          <w:i w:val="false"/>
-          <w:sz w:val="24"/>
-          <w:szCs w:val="24"/>
-          <w:rtl/>
-        </w:rPr>
-        <w:t xml:space="preserve">הקטגוריה הרביעית, הקישור לחוויות אישיות, ממחישה את עקרון הרלוונטיות של ליפמן: אם דבר אינו קשור לחייו של אדם, אין לו למעשה משמעות עבורו (Kizel, 2017b). הסיפורים הקצרים סיפקו לילדים מרחק בטוח, שכן הפוחדים היו חתול, עכבר וילדה בדויה, ובה בעת הזמינו קישור מיידי לחייהם. התנועה הדו-כיוונית שנמצאה בממצאים, מהסיפור אל החיים ("גם אחותי פוחדת מהחושך") ומהחיים אל הסיפור ("אותו דבר העכבר"), היא בדיוק יצירת המשמעות כפעולה שקיזל מתאר: תפיסת יחסים בין חלק לשלם ובין התנסות פרטית לעיקרון כללי (Kizel, 2017b). סיפורה של רימא על הפסקת החשמל, שבו שחזרה צעד אחר צעד את מהלכה של לילא והכריעה שלא להיכנע לפחד, מדגים כיצד תובנה שנרכשה בקהילת החקר הופכת לכלי פעולה בחיים: מהלך מן המעבדה אל הפרקסיס בזעיר אנפין (Kizel, 2016b).</w:t>
-      </w:r>
-    </w:p>
-    <w:p>
-      <w:pPr>
-        <w:bidi/>
-        <w:spacing w:after="120" w:line="360" w:lineRule="auto"/>
-        <w:jc w:val="both"/>
-      </w:pPr>
-      <w:r>
-        <w:rPr>
-          <w:rFonts w:ascii="David" w:cs="David" w:eastAsia="David" w:hAnsi="David"/>
-          <w:b w:val="false"/>
-          <w:i w:val="false"/>
-          <w:sz w:val="24"/>
-          <w:szCs w:val="24"/>
-          <w:rtl/>
-        </w:rPr>
-        <w:t xml:space="preserve">הילדים אף הרחיבו את הדיון מהתמודדות עם פחד אל תורת למידה שלמה: ההתעמלות, האיגרוף והמשחק החדש גויסו כמופתים לכלל "ההתמדה היא הבסיס להצלחה". במונחיו של קיזל, הילדים נעו כאן ממשמעות הרגע אל אופק של משמעות, מן המקרה הפרטי של העכבר והצל אל עיקרון חיים שהם מנסחים לעצמם (Kizel, 2017b). ברוח דבריו של פראנקל, שהמשמעות מתגלה ואינה מומצאת ושמציאתה כרוכה בנטילת אחריות על מימוש הפוטנציאל הייחודי גם בגיל צעיר (Kizel, 2017b), אפשר לראות בכלל שניסחו הילדים לא רק תובנה קוגניטיבית אלא קבלה של אחריות: אם ההתמדה היא הבסיס להצלחה, הרי שההתגברות על הפחד תלויה בי.</w:t>
-      </w:r>
-    </w:p>
-    <w:p>
-      <w:pPr>
-        <w:pStyle w:val="Heading2"/>
-        <w:bidi/>
-        <w:spacing w:after="180" w:before="280" w:line="360" w:lineRule="auto"/>
-        <w:jc w:val="right"/>
-      </w:pPr>
-      <w:r>
-        <w:rPr>
-          <w:rFonts w:ascii="David" w:cs="David" w:eastAsia="David" w:hAnsi="David"/>
-          <w:b/>
-          <w:bCs/>
-          <w:i w:val="false"/>
-          <w:sz w:val="28"/>
-          <w:szCs w:val="28"/>
-          <w:rtl/>
-        </w:rPr>
-        <w:t xml:space="preserve">פרשנות: מענה לשאלות המחקר</w:t>
-      </w:r>
-    </w:p>
-    <w:p>
-      <w:pPr>
-        <w:bidi/>
-        <w:spacing w:after="120" w:line="360" w:lineRule="auto"/>
-        <w:jc w:val="both"/>
-      </w:pPr>
-      <w:r>
-        <w:rPr>
-          <w:rFonts w:ascii="David" w:cs="David" w:eastAsia="David" w:hAnsi="David"/>
-          <w:b w:val="false"/>
-          <w:i w:val="false"/>
-          <w:sz w:val="24"/>
-          <w:szCs w:val="24"/>
-          <w:rtl/>
-        </w:rPr>
-        <w:t xml:space="preserve">לשאלת המחקר הראשונה, מה תופסים הילדים כמקורות הפחד, עולה מן הממצאים תשובה עקבית ומפתיעה בבהירותה: מקור הפחד, בעיני הילדים, אינו העצם אלא אי-הידיעה. הקופסה מפחידה כשהיא סגורה, הצל כשאין יודעים מהו, החושך כשהוא מסתיר את המוכר; גודל, ריקנות ובדידות מעצימים את הפחד. פרשנותי היא שהילדים מחזיקים בתפיסה אפיסטמית של פחד: הם מבינים אותו כפער בין מה שיש למה שידוע. תפיסה זו מקבילה למהלך של שלושת הסיפורים עצמם, אך הילדים לא רק זיהו אותה. הם ניסחו אותה כעיקרון, בחנו את גבולותיה והחילו אותה על עולמם.</w:t>
-      </w:r>
-    </w:p>
-    <w:p>
-      <w:pPr>
-        <w:bidi/>
-        <w:spacing w:after="120" w:line="360" w:lineRule="auto"/>
-        <w:jc w:val="both"/>
-      </w:pPr>
-      <w:r>
-        <w:rPr>
-          <w:rFonts w:ascii="David" w:cs="David" w:eastAsia="David" w:hAnsi="David"/>
-          <w:b w:val="false"/>
-          <w:i w:val="false"/>
-          <w:sz w:val="24"/>
-          <w:szCs w:val="24"/>
-          <w:rtl/>
-        </w:rPr>
-        <w:t xml:space="preserve">לשאלת המחקר השנייה, אילו דרכי התמודדות מציעים הילדים, נמצאו שתי דרכים משלימות, המתאימות לשני פנים של אותה תפיסה: הגילוי וההתרגלות. הגילוי פועל בבת אחת; ברגע שנודע כי בקופסה כדור וכי הצל "הוא אני", הפחד בטל. ההתרגלות פועלת בהדרגה; מפגש חוזר עם דבר שאינו מזיק שוחק את הפחד "אחרי הרבה פעמים". הילדים אף שכללו את התפיסה בשני כיוונים: סייגו אותה (ההתרגלות אינה מיידית, וקופסה חדשה עשויה להפחיד מחדש) והכלילו אותה לעקרון התמדה כללי. בדיונים אלה ביצעו הילדים עבודה מושגית של ממש על ההבחנה בין רגש ובין עמדה כלפי רגש: תובנתם העמוקה ביותר, "זה כבר לא נקרא פחד", מלמדת שהם מבינים כי הרגש אינו גזירת גורל אלא דבר-מה שאפשר לחשוב עליו ולשנותו.</w:t>
-      </w:r>
-    </w:p>
-    <w:p>
-      <w:pPr>
-        <w:bidi/>
-        <w:spacing w:after="120" w:line="360" w:lineRule="auto"/>
-        <w:jc w:val="both"/>
-      </w:pPr>
-      <w:r>
-        <w:rPr>
-          <w:rFonts w:ascii="David" w:cs="David" w:eastAsia="David" w:hAnsi="David"/>
-          <w:b w:val="false"/>
-          <w:i w:val="false"/>
-          <w:sz w:val="24"/>
-          <w:szCs w:val="24"/>
-          <w:rtl/>
-        </w:rPr>
-        <w:t xml:space="preserve">לשאלת המחקר השלישית, כיצד באו לידי ביטוי מאפייני קהילת החקר, מלמדים הממצאים כי בתוך שלושה מפגשים קצרים הופיעו כל ארבעת המאפיינים שמנה ליפמן: הקשבה, בנייה הדדית, אתגור מנומק וחשיפת הנחות. מעבר לכך, הילדים גילו בעלות על השיח: ניסחו את השאלות, בחרו במה לדון, קבעו קריטריונים לשכנוע ושמרו על זכותם שלא להסכים. פרשנותי היא שדווקא נושא הפחד, רגש אוניברסלי שמדברים עליו דרך דמות, שימש קרקע פורייה במיוחד לכינון קהילת חקר ראשונה עם ילדים צעירים כל כך: הוא זימן לכל ילד גם ידע אישי ("גם אני פחדתי") וגם מרחק מגונן (הפוחד הוא החתול). בכך מציעה העבודה חיזוק אמפירי צנוע לטענת קיזל שהפחד המבוגר מפני עיסוק רגשי-קיומי עם ילדים, אותה פדגוגיה של פחד העושה להם פתולוגיזציה, מוגזם ומיותר: הילדים במחקר זה לא נבהלו מן העיסוק בפחד. הם פרחו בו, ויצאו ממנו עם כלים שניסחו בעצמם להתמודדות עימו (Kizel, 2015, 2016c).</w:t>
-      </w:r>
-    </w:p>
-    <w:p>
-      <w:r>
-        <w:br w:type="page"/>
-      </w:r>
-    </w:p>
-    <w:p>
-      <w:pPr>
-        <w:pStyle w:val="Heading1"/>
-        <w:bidi/>
-        <w:spacing w:after="240" w:before="360" w:line="360" w:lineRule="auto"/>
-        <w:jc w:val="right"/>
-      </w:pPr>
-      <w:r>
-        <w:rPr>
-          <w:rFonts w:ascii="David" w:cs="David" w:eastAsia="David" w:hAnsi="David"/>
-          <w:b/>
-          <w:bCs/>
-          <w:i w:val="false"/>
           <w:sz w:val="32"/>
           <w:szCs w:val="32"/>
           <w:rtl/>
         </w:rPr>
-        <w:t xml:space="preserve">סיכום</w:t>
-      </w:r>
-    </w:p>
-    <w:p>
-      <w:pPr>
-        <w:bidi/>
-        <w:spacing w:after="120" w:line="360" w:lineRule="auto"/>
-        <w:jc w:val="both"/>
-      </w:pPr>
-      <w:r>
-        <w:rPr>
-          <w:rFonts w:ascii="David" w:cs="David" w:eastAsia="David" w:hAnsi="David"/>
-          <w:b w:val="false"/>
-          <w:i w:val="false"/>
-          <w:sz w:val="24"/>
-          <w:szCs w:val="24"/>
-          <w:rtl/>
-        </w:rPr>
-        <w:t xml:space="preserve">בעבודה זו ביקשתי לבחון כיצד ילדים בגיל הרך חושבים חשיבה פילוסופית על מושג הפחד במסגרת קהילת חקר פילוסופית. לשם כך קיימתי שלושה מפגשים עם חמישה ילדים בני חמש עד שבע, דוברי ערבית. בכל מפגש קראנו יחד סיפור פילוסופי קצר שכתבתי סביב הפחד, "החתול והקופסה", "העכבר והצל" ו"לילא והחושך", וכל ילד ניסח שאלה משלו; אחד הילדים בחר שאלה והשיב עליה, ומכאן התפתח דיון שבו הילדים הסכימו, חלקו זה על זה ונימקו את עמדותיהם. המפגשים הוקלטו ותומללו במלואם, והנתונים נותחו בניתוח תוכן איכותני שהעלה חמש קטגוריות: הפחד מן הלא-נודע; הידיעה והגילוי כמפיגי פחד; ההתרגלות וההתמדה; הקישור לחוויות אישיות; ומאפייני השיח הפילוסופי של הילדים.</w:t>
-      </w:r>
-    </w:p>
-    <w:p>
-      <w:pPr>
-        <w:bidi/>
-        <w:spacing w:after="120" w:line="360" w:lineRule="auto"/>
-        <w:jc w:val="both"/>
-      </w:pPr>
-      <w:r>
-        <w:rPr>
-          <w:rFonts w:ascii="David" w:cs="David" w:eastAsia="David" w:hAnsi="David"/>
-          <w:b w:val="false"/>
-          <w:i w:val="false"/>
-          <w:sz w:val="24"/>
-          <w:szCs w:val="24"/>
-          <w:rtl/>
-        </w:rPr>
-        <w:t xml:space="preserve">מה עשיתי ומה למדתי? למדתי, ראשית, שילדים בני חמש עד שבע מסוגלים לקיים חקירה פילוסופית של ממש. הם לא רק ענו על שאלות. הם ניסחו שאלות משלהם, ובהן שאלות מושגיות מובהקות ("אם הקופסה גדולה מאוד, האם הפחד יהיה גדול יותר?"), העלו השערות, בחנו אותן במקרים מדומיינים, סייגו הכללות ואף הגדירו מחדש מושג ("זה כבר לא נקרא פחד"). הדבר עומד בניגוד לציפייה הנגזרת מהתיאוריה ההתפתחותית הנוקשה, ומאשש בקנה מידה צנוע את הטענות בדבר כשירותם הפילוסופית של ילדים צעירים.</w:t>
-      </w:r>
-    </w:p>
-    <w:p>
-      <w:pPr>
-        <w:bidi/>
-        <w:spacing w:after="120" w:line="360" w:lineRule="auto"/>
-        <w:jc w:val="both"/>
-      </w:pPr>
-      <w:r>
-        <w:rPr>
-          <w:rFonts w:ascii="David" w:cs="David" w:eastAsia="David" w:hAnsi="David"/>
-          <w:b w:val="false"/>
-          <w:i w:val="false"/>
-          <w:sz w:val="24"/>
-          <w:szCs w:val="24"/>
-          <w:rtl/>
-        </w:rPr>
-        <w:t xml:space="preserve">שנית, למדתי שלילדים תפיסה עקבית ומנומקת של הפחד: הם מבינים אותו כתולדה של אי-ידיעה, ומציעים לו שתי תרופות, הגילוי הפועל בבת אחת וההתרגלות הפועלת בהדרגה. מתוך כך הרחיבו הילדים את הדיון לעקרון חיים כללי של התמדה ואימון, וקשרו אותו לחוויותיהם: התעמלות, משחק חדש, הפסקת חשמל, אח או אחות הפוחדים מהחושך. ראיתי כיצד תובנה שנוסחה בדיון, "כל דבר נשאר במקומו, רק האור נעלם", חוזרת אצל ילדה כהדרכה מעשית לחייה. נוכחתי שקהילת החקר אינה תרגיל אינטלקטואלי בלבד, אלא מרחב שבו ילדים יוצרים משמעות הנוגעת לחייהם ממש.</w:t>
-      </w:r>
-    </w:p>
-    <w:p>
-      <w:pPr>
-        <w:bidi/>
-        <w:spacing w:after="120" w:line="360" w:lineRule="auto"/>
-        <w:jc w:val="both"/>
-      </w:pPr>
-      <w:r>
-        <w:rPr>
-          <w:rFonts w:ascii="David" w:cs="David" w:eastAsia="David" w:hAnsi="David"/>
-          <w:b w:val="false"/>
-          <w:i w:val="false"/>
-          <w:sz w:val="24"/>
-          <w:szCs w:val="24"/>
-          <w:rtl/>
-        </w:rPr>
-        <w:t xml:space="preserve">שלישית, למדתי דבר-מה על עצמי כמנחה. הבחירה לצמצם את נוכחותי, לשאול רק "מי מסכים? מי חושב אחרת? מדוע?" ולהימנע מהבעת עמדה, הייתה קשה, אך היא שאפשרה לתובנות המרכזיות להיאמר כולן מפי הילדים. בה בעת נוכחתי בגבולותיה: היו רגעים שבהם השאלה החוזרת מיצתה את עצמה, והדיון היה יכול להעמיק לו הצעתי שאלת המשך פילוסופית, כגון "מה ההבדל בין להתרגל ובין להפסיק לפחד?". האיזון העדין הזה, בין נסיגה מבוגרת ובין הנחיה מקדמת, הוא בעיניי הלקח המעשי המרכזי של העבודה.</w:t>
-      </w:r>
-    </w:p>
-    <w:p>
-      <w:pPr>
-        <w:bidi/>
-        <w:spacing w:after="120" w:line="360" w:lineRule="auto"/>
-        <w:jc w:val="both"/>
-      </w:pPr>
-      <w:r>
-        <w:rPr>
-          <w:rFonts w:ascii="David" w:cs="David" w:eastAsia="David" w:hAnsi="David"/>
-          <w:b w:val="false"/>
-          <w:i w:val="false"/>
-          <w:sz w:val="24"/>
-          <w:szCs w:val="24"/>
-          <w:rtl/>
-        </w:rPr>
-        <w:t xml:space="preserve">מן הממצאים נגזרות כמה המלצות יישומיות לעבודה חינוכית בגיל הרך. אפשר לקיים קהילת חקר פילוסופית עם ילדים צעירים בהרבה מהמקובל, ודי לשם כך בסיפור קצר בן חמישה משפטים, בשאלה אחת שכל ילד כותב ובשתי שאלות הנחיה חוזרות. מול פחדי ילדים מוצע להחליף את ההרגעה השגרתית ("אין ממה לפחד") בהזמנה לחקירה ("ממה בעצם פוחדים? ואיך הפחד נעלם?"), שכן הילדים במחקר זה הגיעו בכוחות עצמם לתובנות שהרגעה מבוגרת לא הייתה מקנה להם. ומומלץ לקיים את החקירה בשפת אימם של הילדים, תנאי שהתגלה כמאפשר השתתפות מלאה ואותנטית, ממצא רלוונטי במיוחד למחנכות ולמחנכים בחברה הערבית.</w:t>
-      </w:r>
-    </w:p>
-    <w:p>
-      <w:pPr>
-        <w:bidi/>
-        <w:spacing w:after="120" w:line="360" w:lineRule="auto"/>
-        <w:jc w:val="both"/>
-      </w:pPr>
-      <w:r>
-        <w:rPr>
-          <w:rFonts w:ascii="David" w:cs="David" w:eastAsia="David" w:hAnsi="David"/>
-          <w:b w:val="false"/>
-          <w:i w:val="false"/>
-          <w:sz w:val="24"/>
-          <w:szCs w:val="24"/>
-          <w:rtl/>
-        </w:rPr>
-        <w:t xml:space="preserve">לעבודה מגבלות ברורות: קבוצה אחת קטנה של חמישה ילדים, שלושה מפגשים בלבד, וחוקרת אחת שהיא גם המנחה. אין בה יומרה להכללה, אך יש בה תיעוד עשיר של מה שילדים צעירים מסוגלים לו כשנותנים לשאלותיהם מקום. מחקרי המשך יוכלו לבחון קהילות חקר מתמשכות בגיל הרך, להשוות בין נושאים רגשיים שונים ולבדוק כיצד משפיעה שפת החקירה על עומק ההשתתפות. אסיים במה שהילדים עצמם ניסחו טוב ממני: הפחד קטן ככל שהידיעה גדלה, וההתמדה היא הבסיס להצלחה.</w:t>
+        <w:t xml:space="preserve">6. סיכום</w:t>
+      </w:r>
+    </w:p>
+    <w:p>
+      <w:pPr>
+        <w:bidi/>
+        <w:spacing w:after="120" w:line="360" w:lineRule="auto"/>
+        <w:jc w:val="both"/>
+      </w:pPr>
+      <w:r>
+        <w:rPr>
+          <w:rFonts w:ascii="David" w:cs="David" w:eastAsia="David" w:hAnsi="David"/>
+          <w:b w:val="false"/>
+          <w:i w:val="false"/>
+          <w:sz w:val="24"/>
+          <w:szCs w:val="24"/>
+          <w:rtl/>
+        </w:rPr>
+        <w:t xml:space="preserve">בעבודה זו ביקשתי לבחון כיצד ילדים בגיל הרך חושבים חשיבה פילוסופית על מושג הפחד במסגרת קהילת חקר פילוסופית. לשם כך קיימתי שלושה מפגשים עם חמישה ילדים בני חמש עד שבע, דוברי ערבית. בכל מפגש קראנו יחד סיפור פילוסופי קצר שכתבתי סביב הפחד, "החתול והקופסה", "העכבר והצל" ו"לילא והחושך", וכל ילד ניסח שאלה משלו; אחד הילדים בחר שאלה והשיב עליה, ומכאן התפתח דיון שבו הילדים הסכימו, חלקו זה על זה ונימקו את עמדותיהם. המפגשים הוקלטו ותומללו במלואם, והנתונים נותחו בניתוח תוכן איכותני שהעלה חמש קטגוריות: הפחד מן הלא-נודע; הידיעה והגילוי כמפיגי פחד; ההתרגלות וההתמדה; הקישור לחוויות אישיות; ומאפייני השיח הפילוסופי של הילדים. בפרק הדיון נשזרו הקטגוריות הללו לכדי תמונה אחת, שהשיבה על שלוש שאלות המחקר שהוצבו במבוא.</w:t>
+      </w:r>
+    </w:p>
+    <w:p>
+      <w:pPr>
+        <w:bidi/>
+        <w:spacing w:after="120" w:line="360" w:lineRule="auto"/>
+        <w:jc w:val="both"/>
+      </w:pPr>
+      <w:r>
+        <w:rPr>
+          <w:rFonts w:ascii="David" w:cs="David" w:eastAsia="David" w:hAnsi="David"/>
+          <w:b w:val="false"/>
+          <w:i w:val="false"/>
+          <w:sz w:val="24"/>
+          <w:szCs w:val="24"/>
+          <w:rtl/>
+        </w:rPr>
+        <w:t xml:space="preserve">מה עשיתי ומה למדתי? למדתי, ראשית, שילדים בני חמש עד שבע מסוגלים לקיים חקירה פילוסופית של ממש. הם לא רק ענו על שאלות. הם ניסחו שאלות משלהם, ובהן שאלות מושגיות מובהקות ("אם הקופסה גדולה מאוד, האם הפחד יהיה גדול יותר?"), העלו השערות והשיבו עליהן בהשערות נגד, בחנו את טענותיהם במקרים מדומיינים של קופסאות ברזל ועץ וחדרים גדולים וקטנים, סייגו הכללות, ניהלו משא ומתן על מספר הפעמים הדרוש להתרגלות, ואף הגדירו מחדש מושג ("זה כבר לא נקרא פחד"). לצד זה הם ידעו גם לעצור ולהתפעל, מצל ש"חי איתך, הולך איתך", ולצחוק יחד על עכבר שפחד מעצמו. כל אלה עומדים בניגוד לציפייה הנגזרת מהתיאוריה ההתפתחותית הנוקשה, ומאששים בקנה מידה צנוע את הטענות בדבר כשירותם הפילוסופית של ילדים צעירים.</w:t>
+      </w:r>
+    </w:p>
+    <w:p>
+      <w:pPr>
+        <w:bidi/>
+        <w:spacing w:after="120" w:line="360" w:lineRule="auto"/>
+        <w:jc w:val="both"/>
+      </w:pPr>
+      <w:r>
+        <w:rPr>
+          <w:rFonts w:ascii="David" w:cs="David" w:eastAsia="David" w:hAnsi="David"/>
+          <w:b w:val="false"/>
+          <w:i w:val="false"/>
+          <w:sz w:val="24"/>
+          <w:szCs w:val="24"/>
+          <w:rtl/>
+        </w:rPr>
+        <w:t xml:space="preserve">שנית, למדתי שלילדים תפיסה עקבית ומנומקת של הפחד: הם מבינים אותו כתולדה של אי-ידיעה, ומציעים לו שתי תרופות, הגילוי הפועל בבת אחת וההתרגלות הפועלת בהדרגה, ואף מכירים בגבולותיהן, שכן יש מי שממשיך לפחד גם כשהוא יודע. מתוך כך הרחיבו הילדים את הדיון לעקרון חיים כללי של התמדה ואימון, וקשרו אותו לחוויותיהם: התעמלות, משחק חדש, הפסקת חשמל, אח או אחות הפוחדים מהחושך. ראיתי כיצד תובנה שנוסחה בדיון, "כל דבר נשאר במקומו, רק האור נעלם", חוזרת אצל ילדה כהדרכה מעשית לחייה ממש, בסיפורה על כוס המים בהפסקת החשמל. נוכחתי שקהילת החקר אינה תרגיל אינטלקטואלי בלבד, אלא מרחב שבו ילדים יוצרים משמעות הנוגעת לחייהם, ומקבלים על עצמם, במילותיהם שלהם, אחריות להתמודדותם.</w:t>
+      </w:r>
+    </w:p>
+    <w:p>
+      <w:pPr>
+        <w:bidi/>
+        <w:spacing w:after="120" w:line="360" w:lineRule="auto"/>
+        <w:jc w:val="both"/>
+      </w:pPr>
+      <w:r>
+        <w:rPr>
+          <w:rFonts w:ascii="David" w:cs="David" w:eastAsia="David" w:hAnsi="David"/>
+          <w:b w:val="false"/>
+          <w:i w:val="false"/>
+          <w:sz w:val="24"/>
+          <w:szCs w:val="24"/>
+          <w:rtl/>
+        </w:rPr>
+        <w:t xml:space="preserve">שלישית, למדתי דבר-מה על עצמי כמנחה. הבחירה לצמצם את נוכחותי, לשאול רק "מי מסכים? מי חושב אחרת? מדוע?" ולהימנע מהבעת עמדה, הייתה קשה. שוב ושוב התחשק לי לתקן, להסביר, להוביל אל התובנה "הנכונה", ושוב ושוב התברר שההימנעות מכך היא שאפשרה לתובנות המרכזיות להיאמר כולן מפי הילדים. בה בעת נוכחתי בגבולות הנסיגה: היו רגעים שבהם השאלה החוזרת מיצתה את עצמה, והדיון היה יכול להעמיק לו הצעתי שאלת המשך פילוסופית, כגון "מה ההבדל בין להתרגל ובין להפסיק לפחד?". האיזון העדין הזה, בין נסיגה מבוגרת המפנה מקום ובין הנחיה המקדמת את החקירה, הוא בעיניי הלקח המעשי המרכזי של העבודה עבור המשך דרכי החינוכית.</w:t>
+      </w:r>
+    </w:p>
+    <w:p>
+      <w:pPr>
+        <w:bidi/>
+        <w:spacing w:after="120" w:line="360" w:lineRule="auto"/>
+        <w:jc w:val="both"/>
+      </w:pPr>
+      <w:r>
+        <w:rPr>
+          <w:rFonts w:ascii="David" w:cs="David" w:eastAsia="David" w:hAnsi="David"/>
+          <w:b w:val="false"/>
+          <w:i w:val="false"/>
+          <w:sz w:val="24"/>
+          <w:szCs w:val="24"/>
+          <w:rtl/>
+        </w:rPr>
+        <w:t xml:space="preserve">מן הממצאים נגזרות כמה המלצות יישומיות לעבודה חינוכית בגיל הרך. אפשר לקיים קהילת חקר פילוסופית עם ילדים צעירים בהרבה מהמקובל, ודי לשם כך באמצעים פשוטים: סיפור קצר בן חמישה משפטים, דף שעליו כל ילד כותב שאלה אחת, לוח שעליו נתלות השאלות, ושתי שאלות הנחיה חוזרות. מול פחדי ילדים מוצע להחליף את ההרגעה השגרתית ("אין ממה לפחד") בהזמנה לחקירה ("ממה בעצם פוחדים? ואיך הפחד נעלם?"), שכן הילדים במחקר זה הגיעו בכוחות עצמם לתובנות שהרגעה מבוגרת לא הייתה מקנה להם, ואף תרגמו אותן להתנהגות של ממש. מומלץ לבחור נושאים רגשיים המוכרים לילדים מחייהם ולהגיש אותם דרך דמות בדויה, המספקת מרחק מגונן. ומומלץ לקיים את החקירה בשפת אימם של הילדים, תנאי שהתגלה כמאפשר השתתפות מלאה ואותנטית, ממצא רלוונטי במיוחד למחנכות ולמחנכים בחברה הערבית, שבה טרם הוטמעה הפילוסופיה עם ילדים באופן שיטתי.</w:t>
+      </w:r>
+    </w:p>
+    <w:p>
+      <w:pPr>
+        <w:bidi/>
+        <w:spacing w:after="120" w:line="360" w:lineRule="auto"/>
+        <w:jc w:val="both"/>
+      </w:pPr>
+      <w:r>
+        <w:rPr>
+          <w:rFonts w:ascii="David" w:cs="David" w:eastAsia="David" w:hAnsi="David"/>
+          <w:b w:val="false"/>
+          <w:i w:val="false"/>
+          <w:sz w:val="24"/>
+          <w:szCs w:val="24"/>
+          <w:rtl/>
+        </w:rPr>
+        <w:t xml:space="preserve">לעבודה מגבלות ברורות: קבוצה אחת קטנה של חמישה ילדים, שלושה מפגשים בלבד, וחוקרת אחת שהיא גם המנחה וגם המתרגמת של דברי הילדים. אין בה יומרה להכללה, ואין בכוחה להכריע במחלוקות ההתפתחותיות שנסקרו. יש בה, עם זאת, תיעוד עשיר ושיטתי של מה שילדים צעירים מסוגלים לו כשנותנים לשאלותיהם מקום, ובכך תרומה צנועה לספרות המקומית על פילוסופיה עם ילדים בגיל הרך בכלל ובחברה הערבית בפרט. מחקרי המשך יוכלו לבחון קהילות חקר מתמשכות בגיל הרך, להשוות בין נושאים רגשיים שונים כגון פחד, כעס וגעגוע, לבחון קבוצות גדולות ומגוונות יותר, ולבדוק כיצד משפיעה שפת החקירה על עומק ההשתתפות. אסיים במה שהילדים עצמם ניסחו טוב ממני: הפחד קטן ככל שהידיעה גדלה, וההתמדה היא הבסיס להצלחה.</w:t>
       </w:r>
     </w:p>
     <w:p>

</xml_diff>